<commit_message>
Updated docs + documented "new" mode \ feature
</commit_message>
<xml_diff>
--- a/NFE Team products manual EN.docx
+++ b/NFE Team products manual EN.docx
@@ -643,13 +643,7 @@
             <w:rPr>
               <w:noProof/>
             </w:rPr>
-            <w:instrText xml:space="preserve"> P</w:instrText>
-          </w:r>
-          <w:r>
-            <w:rPr>
-              <w:noProof/>
-            </w:rPr>
-            <w:instrText xml:space="preserve">AGEREF _5rtpd3ov5kds \h </w:instrText>
+            <w:instrText xml:space="preserve"> PAGEREF _5rtpd3ov5kds \h </w:instrText>
           </w:r>
           <w:r>
             <w:rPr>
@@ -874,13 +868,7 @@
               <w:rPr>
                 <w:noProof/>
               </w:rPr>
-              <w:t>4.2</w:t>
-            </w:r>
-            <w:r>
-              <w:rPr>
-                <w:noProof/>
-              </w:rPr>
-              <w:t xml:space="preserve"> Smart</w:t>
+              <w:t>4.2 Smart</w:t>
             </w:r>
           </w:hyperlink>
           <w:r>
@@ -934,6 +922,7 @@
             <w:ind w:left="720" w:firstLine="0"/>
             <w:rPr>
               <w:noProof/>
+              <w:lang w:val="en-US"/>
             </w:rPr>
           </w:pPr>
           <w:hyperlink w:anchor="_8gx7p2w64bw9">
@@ -944,6 +933,32 @@
               <w:t>4.2.1 Lazy mode</w:t>
             </w:r>
           </w:hyperlink>
+          <w:r>
+            <w:rPr>
+              <w:noProof/>
+              <w:lang w:val="en-US"/>
+            </w:rPr>
+            <w:t xml:space="preserve">                                                                                                11</w:t>
+          </w:r>
+        </w:p>
+        <w:p>
+          <w:pPr>
+            <w:tabs>
+              <w:tab w:val="right" w:pos="10198"/>
+            </w:tabs>
+            <w:spacing w:before="60" w:line="240" w:lineRule="auto"/>
+            <w:ind w:left="720" w:firstLine="0"/>
+            <w:rPr>
+              <w:noProof/>
+            </w:rPr>
+          </w:pPr>
+          <w:r>
+            <w:rPr>
+              <w:noProof/>
+              <w:lang w:val="en-US"/>
+            </w:rPr>
+            <w:t>4.2.2 Smart preheat mode</w:t>
+          </w:r>
           <w:r>
             <w:rPr>
               <w:noProof/>
@@ -1038,7 +1053,7 @@
             <w:rPr>
               <w:noProof/>
             </w:rPr>
-            <w:t>11</w:t>
+            <w:t>12</w:t>
           </w:r>
           <w:r>
             <w:rPr>
@@ -1099,7 +1114,7 @@
             <w:rPr>
               <w:noProof/>
             </w:rPr>
-            <w:t>12</w:t>
+            <w:t>13</w:t>
           </w:r>
           <w:r>
             <w:rPr>
@@ -1160,7 +1175,7 @@
             <w:rPr>
               <w:noProof/>
             </w:rPr>
-            <w:t>12</w:t>
+            <w:t>13</w:t>
           </w:r>
           <w:r>
             <w:rPr>
@@ -1221,7 +1236,7 @@
             <w:rPr>
               <w:noProof/>
             </w:rPr>
-            <w:t>12</w:t>
+            <w:t>14</w:t>
           </w:r>
           <w:r>
             <w:rPr>
@@ -1284,7 +1299,7 @@
             <w:rPr>
               <w:noProof/>
             </w:rPr>
-            <w:t>14</w:t>
+            <w:t>15</w:t>
           </w:r>
           <w:r>
             <w:rPr>
@@ -1347,7 +1362,7 @@
             <w:rPr>
               <w:noProof/>
             </w:rPr>
-            <w:t>15</w:t>
+            <w:t>16</w:t>
           </w:r>
           <w:r>
             <w:rPr>
@@ -1372,13 +1387,7 @@
               <w:rPr>
                 <w:noProof/>
               </w:rPr>
-              <w:t xml:space="preserve">6.1 Main </w:t>
-            </w:r>
-            <w:r>
-              <w:rPr>
-                <w:noProof/>
-              </w:rPr>
-              <w:t>menu</w:t>
+              <w:t>6.1 Main menu</w:t>
             </w:r>
           </w:hyperlink>
           <w:r>
@@ -1414,7 +1423,7 @@
             <w:rPr>
               <w:noProof/>
             </w:rPr>
-            <w:t>15</w:t>
+            <w:t>16</w:t>
           </w:r>
           <w:r>
             <w:rPr>
@@ -1475,7 +1484,7 @@
             <w:rPr>
               <w:noProof/>
             </w:rPr>
-            <w:t>15</w:t>
+            <w:t>16</w:t>
           </w:r>
           <w:r>
             <w:rPr>
@@ -1536,7 +1545,7 @@
             <w:rPr>
               <w:noProof/>
             </w:rPr>
-            <w:t>15</w:t>
+            <w:t>16</w:t>
           </w:r>
           <w:r>
             <w:rPr>
@@ -1597,7 +1606,7 @@
             <w:rPr>
               <w:noProof/>
             </w:rPr>
-            <w:t>16</w:t>
+            <w:t>17</w:t>
           </w:r>
           <w:r>
             <w:rPr>
@@ -1658,7 +1667,7 @@
             <w:rPr>
               <w:noProof/>
             </w:rPr>
-            <w:t>17</w:t>
+            <w:t>18</w:t>
           </w:r>
           <w:r>
             <w:rPr>
@@ -1684,14 +1693,7 @@
                 <w:b/>
                 <w:noProof/>
               </w:rPr>
-              <w:t>7. Address</w:t>
-            </w:r>
-            <w:r>
-              <w:rPr>
-                <w:b/>
-                <w:noProof/>
-              </w:rPr>
-              <w:t>ing common problems</w:t>
+              <w:t>7. Addressing common problems</w:t>
             </w:r>
           </w:hyperlink>
           <w:r>
@@ -1728,7 +1730,7 @@
             <w:rPr>
               <w:noProof/>
             </w:rPr>
-            <w:t>19</w:t>
+            <w:t>20</w:t>
           </w:r>
           <w:r>
             <w:rPr>
@@ -1789,7 +1791,7 @@
             <w:rPr>
               <w:noProof/>
             </w:rPr>
-            <w:t>19</w:t>
+            <w:t>20</w:t>
           </w:r>
           <w:r>
             <w:rPr>
@@ -1850,7 +1852,7 @@
             <w:rPr>
               <w:noProof/>
             </w:rPr>
-            <w:t>19</w:t>
+            <w:t>20</w:t>
           </w:r>
           <w:r>
             <w:rPr>
@@ -1911,7 +1913,7 @@
             <w:rPr>
               <w:noProof/>
             </w:rPr>
-            <w:t>19</w:t>
+            <w:t>20</w:t>
           </w:r>
           <w:r>
             <w:rPr>
@@ -1972,7 +1974,7 @@
             <w:rPr>
               <w:noProof/>
             </w:rPr>
-            <w:t>20</w:t>
+            <w:t>21</w:t>
           </w:r>
           <w:r>
             <w:rPr>
@@ -2033,7 +2035,7 @@
             <w:rPr>
               <w:noProof/>
             </w:rPr>
-            <w:t>20</w:t>
+            <w:t>21</w:t>
           </w:r>
           <w:r>
             <w:rPr>
@@ -2058,13 +2060,7 @@
               <w:rPr>
                 <w:noProof/>
               </w:rPr>
-              <w:t xml:space="preserve">7.6 Extended </w:t>
-            </w:r>
-            <w:r>
-              <w:rPr>
-                <w:noProof/>
-              </w:rPr>
-              <w:t>error statuses</w:t>
+              <w:t>7.6 Extended error statuses</w:t>
             </w:r>
           </w:hyperlink>
           <w:r>
@@ -2100,7 +2096,7 @@
             <w:rPr>
               <w:noProof/>
             </w:rPr>
-            <w:t>20</w:t>
+            <w:t>21</w:t>
           </w:r>
           <w:r>
             <w:rPr>
@@ -2161,7 +2157,7 @@
             <w:rPr>
               <w:noProof/>
             </w:rPr>
-            <w:t>21</w:t>
+            <w:t>22</w:t>
           </w:r>
           <w:r>
             <w:rPr>
@@ -2224,7 +2220,7 @@
             <w:rPr>
               <w:noProof/>
             </w:rPr>
-            <w:t>22</w:t>
+            <w:t>23</w:t>
           </w:r>
           <w:r>
             <w:rPr>
@@ -2285,7 +2281,7 @@
             <w:rPr>
               <w:noProof/>
             </w:rPr>
-            <w:t>22</w:t>
+            <w:t>23</w:t>
           </w:r>
           <w:r>
             <w:rPr>
@@ -2343,7 +2339,7 @@
             <w:rPr>
               <w:noProof/>
             </w:rPr>
-            <w:t>22</w:t>
+            <w:t>23</w:t>
           </w:r>
           <w:r>
             <w:rPr>
@@ -2378,7 +2374,6 @@
       <w:bookmarkStart w:id="4" w:name="_ilw9qie8hwa4" w:colFirst="0" w:colLast="0"/>
       <w:bookmarkEnd w:id="4"/>
       <w:r>
-        <w:lastRenderedPageBreak/>
         <w:t xml:space="preserve">1. </w:t>
       </w:r>
       <w:proofErr w:type="spellStart"/>
@@ -2561,13 +2556,7 @@
               <w:rPr>
                 <w:lang w:val="en-US"/>
               </w:rPr>
-              <w:t>Never remove the batteries or open the hinged cover while the device is charging or connected to a computer. This is very likely to burn out several chips that are responsible for powering the screen, the transistor drivers of the DC-DC converter output tr</w:t>
-            </w:r>
-            <w:r>
-              <w:rPr>
-                <w:lang w:val="en-US"/>
-              </w:rPr>
-              <w:t>ansistors, and the charging module.</w:t>
+              <w:t>Never remove the batteries or open the hinged cover while the device is charging or connected to a computer. This is very likely to burn out several chips that are responsible for powering the screen, the transistor drivers of the DC-DC converter output transistors, and the charging module.</w:t>
             </w:r>
           </w:p>
         </w:tc>
@@ -2956,13 +2945,7 @@
         <w:rPr>
           <w:lang w:val="en-US"/>
         </w:rPr>
-        <w:t>is a program to monitor, update and confi</w:t>
-      </w:r>
-      <w:r>
-        <w:rPr>
-          <w:lang w:val="en-US"/>
-        </w:rPr>
-        <w:t xml:space="preserve">gure </w:t>
+        <w:t xml:space="preserve">is a program to monitor, update and configure </w:t>
       </w:r>
       <w:proofErr w:type="spellStart"/>
       <w:r>
@@ -3148,10 +3131,7 @@
       </w:pPr>
       <w:proofErr w:type="spellStart"/>
       <w:r>
-        <w:t>Customizabl</w:t>
-      </w:r>
-      <w:r>
-        <w:t>e</w:t>
+        <w:t>Customizable</w:t>
       </w:r>
       <w:proofErr w:type="spellEnd"/>
       <w:r>
@@ -3453,7 +3433,6 @@
       <w:bookmarkStart w:id="6" w:name="_8ufhv1nx9ytf" w:colFirst="0" w:colLast="0"/>
       <w:bookmarkEnd w:id="6"/>
       <w:r>
-        <w:lastRenderedPageBreak/>
         <w:t xml:space="preserve">1.2 </w:t>
       </w:r>
       <w:proofErr w:type="spellStart"/>
@@ -3515,13 +3494,7 @@
         <w:rPr>
           <w:lang w:val="en-US"/>
         </w:rPr>
-        <w:t xml:space="preserve">Output power </w:t>
-      </w:r>
-      <w:r>
-        <w:rPr>
-          <w:lang w:val="en-US"/>
-        </w:rPr>
-        <w:t>(depending on the device);</w:t>
+        <w:t>Output power (depending on the device);</w:t>
       </w:r>
     </w:p>
     <w:p>
@@ -3602,13 +3575,7 @@
         <w:rPr>
           <w:lang w:val="en-US"/>
         </w:rPr>
-        <w:t>"Device-specific" means that each dev</w:t>
-      </w:r>
-      <w:r>
-        <w:rPr>
-          <w:lang w:val="en-US"/>
-        </w:rPr>
-        <w:t>ice has its own values, which are set by the manufacturer. You can find the exact values on the product page of the manufacturer's website.</w:t>
+        <w:t>"Device-specific" means that each device has its own values, which are set by the manufacturer. You can find the exact values on the product page of the manufacturer's website.</w:t>
       </w:r>
     </w:p>
     <w:p>
@@ -3654,7 +3621,6 @@
         <w:rPr>
           <w:lang w:val="en-US"/>
         </w:rPr>
-        <w:lastRenderedPageBreak/>
         <w:t>2. Supported devices</w:t>
       </w:r>
     </w:p>
@@ -8259,7 +8225,6 @@
         <w:rPr>
           <w:lang w:val="en-US"/>
         </w:rPr>
-        <w:lastRenderedPageBreak/>
         <w:t>2.1 Version compatibility</w:t>
       </w:r>
     </w:p>
@@ -8300,13 +8265,7 @@
         <w:rPr>
           <w:lang w:val="en-US"/>
         </w:rPr>
-        <w:t>The latest bui</w:t>
-      </w:r>
-      <w:r>
-        <w:rPr>
-          <w:lang w:val="en-US"/>
-        </w:rPr>
-        <w:t xml:space="preserve">lds of NFE Tools and </w:t>
+        <w:t xml:space="preserve">The latest builds of NFE Tools and </w:t>
       </w:r>
       <w:proofErr w:type="spellStart"/>
       <w:r>
@@ -8365,13 +8324,7 @@
         <w:rPr>
           <w:lang w:val="en-US"/>
         </w:rPr>
-        <w:t xml:space="preserve">- </w:t>
-      </w:r>
-      <w:r>
-        <w:rPr>
-          <w:lang w:val="en-US"/>
-        </w:rPr>
-        <w:t>P stands for protocol, XX stands for protocol version, for example: P10;</w:t>
+        <w:t>- P stands for protocol, XX stands for protocol version, for example: P10;</w:t>
       </w:r>
     </w:p>
     <w:p>
@@ -8467,7 +8420,6 @@
         <w:rPr>
           <w:lang w:val="en-US"/>
         </w:rPr>
-        <w:lastRenderedPageBreak/>
         <w:t>3. Installation</w:t>
       </w:r>
     </w:p>
@@ -8673,13 +8625,7 @@
         <w:rPr>
           <w:lang w:val="en-US"/>
         </w:rPr>
-        <w:t xml:space="preserve">The installation process is very simple and does </w:t>
-      </w:r>
-      <w:r>
-        <w:rPr>
-          <w:lang w:val="en-US"/>
-        </w:rPr>
-        <w:t>not require any special knowledge and skills.</w:t>
+        <w:t>The installation process is very simple and does not require any special knowledge and skills.</w:t>
       </w:r>
     </w:p>
     <w:p>
@@ -8789,13 +8735,7 @@
         <w:rPr>
           <w:lang w:val="en-US"/>
         </w:rPr>
-        <w:t>The firmware update window w</w:t>
-      </w:r>
-      <w:r>
-        <w:rPr>
-          <w:lang w:val="en-US"/>
-        </w:rPr>
-        <w:t>ill appear, you need to click the big "Update" button:</w:t>
+        <w:t>The firmware update window will appear, you need to click the big "Update" button:</w:t>
       </w:r>
     </w:p>
     <w:p>
@@ -8803,7 +8743,6 @@
         <w:rPr>
           <w:noProof/>
         </w:rPr>
-        <w:lastRenderedPageBreak/>
         <w:drawing>
           <wp:inline distT="114300" distB="114300" distL="114300" distR="114300" wp14:anchorId="0C9E03DB" wp14:editId="2506B04E">
             <wp:extent cx="2924175" cy="2743200"/>
@@ -8858,7 +8797,6 @@
         <w:rPr>
           <w:lang w:val="en-US"/>
         </w:rPr>
-        <w:lastRenderedPageBreak/>
         <w:t xml:space="preserve">Select the previously downloaded .bin file with the </w:t>
       </w:r>
       <w:proofErr w:type="spellStart"/>
@@ -8991,13 +8929,7 @@
         <w:rPr>
           <w:lang w:val="en-US"/>
         </w:rPr>
-        <w:t>After a few seconds, you will see a notification that the firmwa</w:t>
-      </w:r>
-      <w:r>
-        <w:rPr>
-          <w:lang w:val="en-US"/>
-        </w:rPr>
-        <w:t>re has been successfully installed:</w:t>
+        <w:t>After a few seconds, you will see a notification that the firmware has been successfully installed:</w:t>
       </w:r>
     </w:p>
     <w:p>
@@ -9089,7 +9021,6 @@
         <w:rPr>
           <w:lang w:val="en-US"/>
         </w:rPr>
-        <w:lastRenderedPageBreak/>
         <w:t>4. description of the main features</w:t>
       </w:r>
     </w:p>
@@ -9160,13 +9091,7 @@
         <w:rPr>
           <w:lang w:val="en-US"/>
         </w:rPr>
-        <w:t xml:space="preserve"> parameters. Ther</w:t>
-      </w:r>
-      <w:r>
-        <w:rPr>
-          <w:lang w:val="en-US"/>
-        </w:rPr>
-        <w:t xml:space="preserve">e are 8 profiles available to the user, which can be customized using </w:t>
+        <w:t xml:space="preserve"> parameters. There are 8 profiles available to the user, which can be customized using </w:t>
       </w:r>
       <w:proofErr w:type="spellStart"/>
       <w:r>
@@ -9499,13 +9424,7 @@
         <w:rPr>
           <w:lang w:val="en-US"/>
         </w:rPr>
-        <w:t>Can be set as time and installed</w:t>
-      </w:r>
-      <w:r>
-        <w:rPr>
-          <w:lang w:val="en-US"/>
-        </w:rPr>
-        <w:t xml:space="preserve"> power or percentage of power. A more advanced setting is also available: a graph of power versus time.</w:t>
+        <w:t>Can be set as time and installed power or percentage of power. A more advanced setting is also available: a graph of power versus time.</w:t>
       </w:r>
     </w:p>
     <w:p>
@@ -9699,13 +9618,7 @@
         <w:rPr>
           <w:lang w:val="en-US"/>
         </w:rPr>
-        <w:t xml:space="preserve"> firmware: you need</w:t>
-      </w:r>
-      <w:r>
-        <w:rPr>
-          <w:lang w:val="en-US"/>
-        </w:rPr>
-        <w:t xml:space="preserve"> to select the coil material, if you don't have it, set TCR or import TFR graph. After that, you need to spin the atomizer at room temperature (20 °C) and lock the resistance. </w:t>
+        <w:t xml:space="preserve"> firmware: you need to select the coil material, if you don't have it, set TCR or import TFR graph. After that, you need to spin the atomizer at room temperature (20 °C) and lock the resistance. </w:t>
       </w:r>
       <w:proofErr w:type="spellStart"/>
       <w:r>
@@ -9787,13 +9700,7 @@
         <w:rPr>
           <w:lang w:val="en-US"/>
         </w:rPr>
-        <w:t>Set the resistance lock to the button</w:t>
-      </w:r>
-      <w:r>
-        <w:rPr>
-          <w:lang w:val="en-US"/>
-        </w:rPr>
-        <w:t xml:space="preserve"> combination in </w:t>
+        <w:t xml:space="preserve">Set the resistance lock to the button combination in </w:t>
       </w:r>
       <w:proofErr w:type="spellStart"/>
       <w:r>
@@ -9989,13 +9896,7 @@
         <w:rPr>
           <w:lang w:val="en-US"/>
         </w:rPr>
-        <w:t>You can res</w:t>
-      </w:r>
-      <w:r>
-        <w:rPr>
-          <w:lang w:val="en-US"/>
-        </w:rPr>
-        <w:t>et or edit the saved profile resistance in two ways:</w:t>
+        <w:t>You can reset or edit the saved profile resistance in two ways:</w:t>
       </w:r>
     </w:p>
     <w:p>
@@ -10226,56 +10127,44 @@
     <w:p>
       <w:pPr>
         <w:pStyle w:val="3"/>
+        <w:rPr>
+          <w:lang w:val="en-US"/>
+        </w:rPr>
       </w:pPr>
       <w:bookmarkStart w:id="17" w:name="_sqrz1a8cwr78" w:colFirst="0" w:colLast="0"/>
       <w:bookmarkEnd w:id="17"/>
       <w:r>
-        <w:t xml:space="preserve">4.1.3. PI </w:t>
+        <w:rPr>
+          <w:lang w:val="en-US"/>
+        </w:rPr>
+        <w:t>4.1.3. PI controller</w:t>
+      </w:r>
+    </w:p>
+    <w:p>
+      <w:pPr>
+        <w:rPr>
+          <w:lang w:val="en-US"/>
+        </w:rPr>
+      </w:pPr>
+      <w:r>
+        <w:rPr>
+          <w:lang w:val="en-US"/>
+        </w:rPr>
+        <w:t xml:space="preserve">To improve power and temperature stabilization in </w:t>
       </w:r>
       <w:proofErr w:type="spellStart"/>
       <w:r>
-        <w:t>controller</w:t>
+        <w:rPr>
+          <w:lang w:val="en-US"/>
+        </w:rPr>
+        <w:t>thermocontrol</w:t>
       </w:r>
       <w:proofErr w:type="spellEnd"/>
-    </w:p>
-    <w:p>
-      <w:pPr>
-        <w:rPr>
-          <w:lang w:val="en-US"/>
-        </w:rPr>
-      </w:pPr>
-      <w:r>
-        <w:rPr>
-          <w:lang w:val="en-US"/>
-        </w:rPr>
-        <w:t xml:space="preserve">To improve power and temperature stabilization in </w:t>
-      </w:r>
-      <w:proofErr w:type="spellStart"/>
-      <w:r>
-        <w:rPr>
-          <w:lang w:val="en-US"/>
-        </w:rPr>
-        <w:t>thermocontrol</w:t>
-      </w:r>
-      <w:proofErr w:type="spellEnd"/>
-      <w:r>
-        <w:rPr>
-          <w:lang w:val="en-US"/>
-        </w:rPr>
-        <w:t xml:space="preserve"> mode, the firmware implements a full-fledged PI control</w:t>
-      </w:r>
-      <w:r>
-        <w:rPr>
-          <w:lang w:val="en-US"/>
-        </w:rPr>
-        <w:t xml:space="preserve">ler. The detailed principles of its operation can be found </w:t>
-      </w:r>
-      <w:r>
-        <w:rPr>
-          <w:lang w:val="en-US"/>
-        </w:rPr>
-        <w:lastRenderedPageBreak/>
-        <w:t xml:space="preserve">in </w:t>
+      <w:r>
+        <w:rPr>
+          <w:lang w:val="en-US"/>
+        </w:rPr>
+        <w:t xml:space="preserve"> mode, the firmware implements a full-fledged PI controller. The detailed principles of its operation can be found in </w:t>
       </w:r>
       <w:hyperlink r:id="rId21">
         <w:r>
@@ -10290,13 +10179,7 @@
         <w:rPr>
           <w:lang w:val="en-US"/>
         </w:rPr>
-        <w:t xml:space="preserve"> as their description will take a couple of th</w:t>
-      </w:r>
-      <w:r>
-        <w:rPr>
-          <w:lang w:val="en-US"/>
-        </w:rPr>
-        <w:t>ree pages. In simplified understanding, the PI-regulator has the following settings:</w:t>
+        <w:t xml:space="preserve"> as their description will take a couple of three pages. In simplified understanding, the PI-regulator has the following settings:</w:t>
       </w:r>
     </w:p>
     <w:p>
@@ -10346,13 +10229,7 @@
         <w:rPr>
           <w:lang w:val="en-US"/>
         </w:rPr>
-        <w:t>is a proportional con</w:t>
-      </w:r>
-      <w:r>
-        <w:rPr>
-          <w:lang w:val="en-US"/>
-        </w:rPr>
-        <w:t>stant, the higher the value, the more the power adjustment changes. For example, on simple spirals it is better to increase the value, because they lose temperature quickly, unlike more weighty spirals.</w:t>
+        <w:t>is a proportional constant, the higher the value, the more the power adjustment changes. For example, on simple spirals it is better to increase the value, because they lose temperature quickly, unlike more weighty spirals.</w:t>
       </w:r>
     </w:p>
     <w:p>
@@ -10376,13 +10253,7 @@
         <w:rPr>
           <w:lang w:val="en-US"/>
         </w:rPr>
-        <w:t xml:space="preserve">- integral constant; responsible for smoothing the </w:t>
-      </w:r>
-      <w:r>
-        <w:rPr>
-          <w:lang w:val="en-US"/>
-        </w:rPr>
-        <w:t xml:space="preserve">power control peaks. </w:t>
+        <w:t xml:space="preserve">- integral constant; responsible for smoothing the power control peaks. </w:t>
       </w:r>
     </w:p>
     <w:p>
@@ -10411,13 +10282,7 @@
         <w:rPr>
           <w:lang w:val="en-US"/>
         </w:rPr>
-        <w:t>Profile switching is possible both in manual mode and in automatic mode - based on stored resistances, with a customizable tolerance for determining compliance. All you need to use automatic switching is to activate the "Sma</w:t>
-      </w:r>
-      <w:r>
-        <w:rPr>
-          <w:lang w:val="en-US"/>
-        </w:rPr>
-        <w:t xml:space="preserve">rt" mode and assign the corresponding profiles to the atomizers by screwing them on one by one. You can also prepare a profile in advance using </w:t>
+        <w:t xml:space="preserve">Profile switching is possible both in manual mode and in automatic mode - based on stored resistances, with a customizable tolerance for determining compliance. All you need to use automatic switching is to activate the "Smart" mode and assign the corresponding profiles to the atomizers by screwing them on one by one. You can also prepare a profile in advance using </w:t>
       </w:r>
       <w:proofErr w:type="spellStart"/>
       <w:r>
@@ -10444,32 +10309,20 @@
         <w:rPr>
           <w:lang w:val="en-US"/>
         </w:rPr>
-        <w:t>When you install the atomizer later, the profile saved for it will be selected automatically. If no ma</w:t>
-      </w:r>
-      <w:r>
-        <w:rPr>
-          <w:lang w:val="en-US"/>
-        </w:rPr>
-        <w:t>tches are found in the profiles when defining the atomizer, you will be prompted to assign a new profile/edit the current profile.</w:t>
-      </w:r>
-    </w:p>
-    <w:p>
-      <w:pPr>
-        <w:rPr>
-          <w:lang w:val="en-US"/>
-        </w:rPr>
-      </w:pPr>
-      <w:r>
-        <w:rPr>
-          <w:lang w:val="en-US"/>
-        </w:rPr>
-        <w:t>When selecting a profile manually, if there is a resistance mismatch, you will be prompted to confirm whether to update or sa</w:t>
-      </w:r>
-      <w:r>
-        <w:rPr>
-          <w:lang w:val="en-US"/>
-        </w:rPr>
-        <w:t>ve the selected profile.</w:t>
+        <w:t>When you install the atomizer later, the profile saved for it will be selected automatically. If no matches are found in the profiles when defining the atomizer, you will be prompted to assign a new profile/edit the current profile.</w:t>
+      </w:r>
+    </w:p>
+    <w:p>
+      <w:pPr>
+        <w:rPr>
+          <w:lang w:val="en-US"/>
+        </w:rPr>
+      </w:pPr>
+      <w:r>
+        <w:rPr>
+          <w:lang w:val="en-US"/>
+        </w:rPr>
+        <w:t>When selecting a profile manually, if there is a resistance mismatch, you will be prompted to confirm whether to update or save the selected profile.</w:t>
       </w:r>
     </w:p>
     <w:p>
@@ -10512,33 +10365,1072 @@
         <w:rPr>
           <w:lang w:val="en-US"/>
         </w:rPr>
-        <w:t>, the profile will not</w:t>
-      </w:r>
-      <w:r>
-        <w:rPr>
-          <w:lang w:val="en-US"/>
-        </w:rPr>
-        <w:t xml:space="preserve"> be switched automatically.</w:t>
-      </w:r>
+        <w:t>, the profile will not be switched automatically.</w:t>
+      </w:r>
+    </w:p>
+    <w:p>
+      <w:pPr>
+        <w:rPr>
+          <w:lang w:val="en-US"/>
+        </w:rPr>
+      </w:pPr>
+    </w:p>
+    <w:p>
+      <w:pPr>
+        <w:pStyle w:val="3"/>
+        <w:rPr>
+          <w:lang w:val="ru-RU"/>
+        </w:rPr>
+      </w:pPr>
+      <w:r>
+        <w:rPr>
+          <w:lang w:val="ru-RU"/>
+        </w:rPr>
+        <w:t>4.2.</w:t>
+      </w:r>
+      <w:r>
+        <w:rPr>
+          <w:lang w:val="ru-RU"/>
+        </w:rPr>
+        <w:t>2</w:t>
+      </w:r>
+      <w:r>
+        <w:rPr>
+          <w:lang w:val="ru-RU"/>
+        </w:rPr>
+        <w:t xml:space="preserve"> </w:t>
+      </w:r>
+      <w:r>
+        <w:rPr>
+          <w:lang w:val="en-US"/>
+        </w:rPr>
+        <w:t>Smart preheat</w:t>
+      </w:r>
+      <w:r>
+        <w:rPr>
+          <w:lang w:val="ru-RU"/>
+        </w:rPr>
+        <w:t xml:space="preserve"> mode</w:t>
+      </w:r>
+    </w:p>
+    <w:p>
+      <w:pPr>
+        <w:rPr>
+          <w:lang w:val="en-US"/>
+        </w:rPr>
+      </w:pPr>
+      <w:r>
+        <w:rPr>
+          <w:lang w:val="en-US"/>
+        </w:rPr>
+        <w:t>The Smart Preheat feature intelligently modulates the preheat power based on the time interval between consecutive puffs. This provides a consistent experience by reducing the preheat intensity when puffs are taken in rapid succession.</w:t>
+      </w:r>
+    </w:p>
+    <w:p>
+      <w:pPr>
+        <w:ind w:firstLine="0"/>
+        <w:rPr>
+          <w:lang w:val="en-US"/>
+        </w:rPr>
+      </w:pPr>
+      <w:r>
+        <w:rPr>
+          <w:lang w:val="en-US"/>
+        </w:rPr>
+        <w:t>Key Parameters:</w:t>
+      </w:r>
+    </w:p>
+    <w:p>
+      <w:pPr>
+        <w:ind w:firstLine="0"/>
+        <w:rPr>
+          <w:lang w:val="en-US"/>
+        </w:rPr>
+      </w:pPr>
+      <w:r>
+        <w:rPr>
+          <w:lang w:val="en-US"/>
+        </w:rPr>
+        <w:t>Power: The base operating power (</w:t>
+      </w:r>
+      <w:r>
+        <w:rPr>
+          <w:color w:val="FF0000"/>
+          <w:lang w:val="en-US"/>
+        </w:rPr>
+        <w:t>P</w:t>
+      </w:r>
+      <w:r>
+        <w:rPr>
+          <w:lang w:val="en-US"/>
+        </w:rPr>
+        <w:t>).</w:t>
+      </w:r>
+    </w:p>
+    <w:p>
+      <w:pPr>
+        <w:ind w:firstLine="0"/>
+        <w:rPr>
+          <w:lang w:val="en-US"/>
+        </w:rPr>
+      </w:pPr>
+      <w:r>
+        <w:rPr>
+          <w:lang w:val="en-US"/>
+        </w:rPr>
+        <w:t>Preheat (%): The initial power boost, expressed as a percentage of the base power (</w:t>
+      </w:r>
+      <w:r>
+        <w:rPr>
+          <w:highlight w:val="green"/>
+          <w:lang w:val="en-US"/>
+        </w:rPr>
+        <w:t>PP</w:t>
+      </w:r>
+      <w:r>
+        <w:rPr>
+          <w:lang w:val="en-US"/>
+        </w:rPr>
+        <w:t>).</w:t>
+      </w:r>
+    </w:p>
+    <w:p>
+      <w:pPr>
+        <w:ind w:firstLine="0"/>
+        <w:rPr>
+          <w:lang w:val="en-US"/>
+        </w:rPr>
+      </w:pPr>
+      <w:r>
+        <w:rPr>
+          <w:lang w:val="en-US"/>
+        </w:rPr>
+        <w:t>Preheat Time: The duration for which the preheat power is applied (</w:t>
+      </w:r>
+      <w:r>
+        <w:rPr>
+          <w:color w:val="0070C0"/>
+          <w:lang w:val="en-US"/>
+        </w:rPr>
+        <w:t>TP</w:t>
+      </w:r>
+      <w:r>
+        <w:rPr>
+          <w:lang w:val="en-US"/>
+        </w:rPr>
+        <w:t>).</w:t>
+      </w:r>
+    </w:p>
+    <w:p>
+      <w:pPr>
+        <w:ind w:firstLine="0"/>
+        <w:rPr>
+          <w:lang w:val="en-US"/>
+        </w:rPr>
+      </w:pPr>
+      <w:r>
+        <w:rPr>
+          <w:lang w:val="en-US"/>
+        </w:rPr>
+        <w:t>Preheat Delay: The cooldown period after a puff, after which the preheat will activate at full intensity again (</w:t>
+      </w:r>
+      <w:r>
+        <w:rPr>
+          <w:highlight w:val="magenta"/>
+          <w:lang w:val="en-US"/>
+        </w:rPr>
+        <w:t>TD</w:t>
+      </w:r>
+      <w:r>
+        <w:rPr>
+          <w:lang w:val="en-US"/>
+        </w:rPr>
+        <w:t>).</w:t>
+      </w:r>
+    </w:p>
+    <w:p>
+      <w:pPr>
+        <w:ind w:firstLine="0"/>
+        <w:rPr>
+          <w:lang w:val="en-US"/>
+        </w:rPr>
+      </w:pPr>
+      <w:r>
+        <w:rPr>
+          <w:b/>
+          <w:bCs/>
+          <w:lang w:val="en-US"/>
+        </w:rPr>
+        <w:t>Standard</w:t>
+      </w:r>
+      <w:r>
+        <w:rPr>
+          <w:lang w:val="en-US"/>
+        </w:rPr>
+        <w:t xml:space="preserve"> Preheat Operation:</w:t>
+      </w:r>
+    </w:p>
+    <w:p>
+      <w:pPr>
+        <w:ind w:firstLine="0"/>
+        <w:rPr>
+          <w:lang w:val="en-US"/>
+        </w:rPr>
+      </w:pPr>
+      <w:r>
+        <w:rPr>
+          <w:lang w:val="en-US"/>
+        </w:rPr>
+        <w:t>In the standard mode, preheat activates at the set percentage only if the time since the last puff (</w:t>
+      </w:r>
+      <w:r>
+        <w:rPr>
+          <w:highlight w:val="cyan"/>
+          <w:lang w:val="en-US"/>
+        </w:rPr>
+        <w:t>T</w:t>
+      </w:r>
+      <w:r>
+        <w:rPr>
+          <w:lang w:val="en-US"/>
+        </w:rPr>
+        <w:t>) exceeds the configured Preheat Delay (</w:t>
+      </w:r>
+      <w:r>
+        <w:rPr>
+          <w:highlight w:val="magenta"/>
+          <w:lang w:val="en-US"/>
+        </w:rPr>
+        <w:t>TD</w:t>
+      </w:r>
+      <w:r>
+        <w:rPr>
+          <w:lang w:val="en-US"/>
+        </w:rPr>
+        <w:t>).</w:t>
+      </w:r>
+    </w:p>
+    <w:p>
+      <w:pPr>
+        <w:ind w:firstLine="0"/>
+        <w:rPr>
+          <w:lang w:val="en-US"/>
+        </w:rPr>
+      </w:pPr>
+      <w:r>
+        <w:rPr>
+          <w:lang w:val="en-US"/>
+        </w:rPr>
+        <w:t xml:space="preserve">If </w:t>
+      </w:r>
+      <w:r>
+        <w:rPr>
+          <w:highlight w:val="cyan"/>
+          <w:lang w:val="en-US"/>
+        </w:rPr>
+        <w:t>T</w:t>
+      </w:r>
+      <w:r>
+        <w:rPr>
+          <w:lang w:val="en-US"/>
+        </w:rPr>
+        <w:t xml:space="preserve"> ≥ </w:t>
+      </w:r>
+      <w:r>
+        <w:rPr>
+          <w:highlight w:val="magenta"/>
+          <w:lang w:val="en-US"/>
+        </w:rPr>
+        <w:t>TD</w:t>
+      </w:r>
+      <w:r>
+        <w:rPr>
+          <w:lang w:val="en-US"/>
+        </w:rPr>
+        <w:t>: Preheat activates at full power (</w:t>
+      </w:r>
+      <w:r>
+        <w:rPr>
+          <w:color w:val="FF0000"/>
+          <w:lang w:val="en-US"/>
+        </w:rPr>
+        <w:t>P</w:t>
+      </w:r>
+      <w:r>
+        <w:rPr>
+          <w:lang w:val="en-US"/>
+        </w:rPr>
+        <w:t xml:space="preserve"> * </w:t>
+      </w:r>
+      <w:r>
+        <w:rPr>
+          <w:highlight w:val="green"/>
+          <w:lang w:val="en-US"/>
+        </w:rPr>
+        <w:t>PP</w:t>
+      </w:r>
+      <w:r>
+        <w:rPr>
+          <w:lang w:val="en-US"/>
+        </w:rPr>
+        <w:t>).</w:t>
+      </w:r>
+    </w:p>
+    <w:p>
+      <w:pPr>
+        <w:ind w:firstLine="0"/>
+        <w:rPr>
+          <w:lang w:val="en-US"/>
+        </w:rPr>
+      </w:pPr>
+      <w:r>
+        <w:rPr>
+          <w:lang w:val="en-US"/>
+        </w:rPr>
+        <w:t xml:space="preserve">If </w:t>
+      </w:r>
+      <w:r>
+        <w:rPr>
+          <w:highlight w:val="cyan"/>
+          <w:lang w:val="en-US"/>
+        </w:rPr>
+        <w:t>T</w:t>
+      </w:r>
+      <w:r>
+        <w:rPr>
+          <w:lang w:val="en-US"/>
+        </w:rPr>
+        <w:t xml:space="preserve"> &lt; </w:t>
+      </w:r>
+      <w:r>
+        <w:rPr>
+          <w:highlight w:val="magenta"/>
+          <w:lang w:val="en-US"/>
+        </w:rPr>
+        <w:t>TD</w:t>
+      </w:r>
+      <w:r>
+        <w:rPr>
+          <w:lang w:val="en-US"/>
+        </w:rPr>
+        <w:t xml:space="preserve">: </w:t>
+      </w:r>
+      <w:r>
+        <w:rPr>
+          <w:u w:val="single"/>
+          <w:lang w:val="en-US"/>
+        </w:rPr>
+        <w:t>Preheat does not activate</w:t>
+      </w:r>
+      <w:r>
+        <w:rPr>
+          <w:lang w:val="en-US"/>
+        </w:rPr>
+        <w:t>; the coil is heated at the base power (</w:t>
+      </w:r>
+      <w:r>
+        <w:rPr>
+          <w:color w:val="FF0000"/>
+          <w:lang w:val="en-US"/>
+        </w:rPr>
+        <w:t>P</w:t>
+      </w:r>
+      <w:r>
+        <w:rPr>
+          <w:lang w:val="en-US"/>
+        </w:rPr>
+        <w:t>).</w:t>
+      </w:r>
+    </w:p>
+    <w:p>
+      <w:pPr>
+        <w:rPr>
+          <w:lang w:val="en-US"/>
+        </w:rPr>
+      </w:pPr>
+    </w:p>
+    <w:p>
+      <w:pPr>
+        <w:ind w:firstLine="0"/>
+        <w:rPr>
+          <w:lang w:val="en-US"/>
+        </w:rPr>
+      </w:pPr>
+      <w:r>
+        <w:rPr>
+          <w:b/>
+          <w:bCs/>
+          <w:lang w:val="en-US"/>
+        </w:rPr>
+        <w:t>Smart</w:t>
+      </w:r>
+      <w:r>
+        <w:rPr>
+          <w:lang w:val="en-US"/>
+        </w:rPr>
+        <w:t xml:space="preserve"> Preheat Operation:</w:t>
+      </w:r>
+    </w:p>
+    <w:p>
+      <w:pPr>
+        <w:ind w:firstLine="0"/>
+        <w:rPr>
+          <w:lang w:val="en-US"/>
+        </w:rPr>
+      </w:pPr>
+      <w:r>
+        <w:rPr>
+          <w:lang w:val="en-US"/>
+        </w:rPr>
+        <w:t>When Smart Preheat is enabled, the preheat power is dynamically calculated if a new puff is initiated before the Preheat Delay has fully elapsed. The intensity scales linearly with the time that has passed.</w:t>
+      </w:r>
+    </w:p>
+    <w:p>
+      <w:pPr>
+        <w:ind w:firstLine="0"/>
+        <w:rPr>
+          <w:lang w:val="en-US"/>
+        </w:rPr>
+      </w:pPr>
+      <w:r>
+        <w:rPr>
+          <w:lang w:val="en-US"/>
+        </w:rPr>
+        <w:t>T</w:t>
+      </w:r>
+      <w:r>
+        <w:rPr>
+          <w:lang w:val="en-US"/>
+        </w:rPr>
+        <w:t>he formula for calculating the Smart Preheat power (</w:t>
+      </w:r>
+      <w:r>
+        <w:rPr>
+          <w:highlight w:val="yellow"/>
+          <w:lang w:val="en-US"/>
+        </w:rPr>
+        <w:t>PSP</w:t>
+      </w:r>
+      <w:r>
+        <w:rPr>
+          <w:lang w:val="en-US"/>
+        </w:rPr>
+        <w:t>) is:</w:t>
+      </w:r>
+    </w:p>
+    <w:p>
+      <w:pPr>
+        <w:ind w:firstLine="0"/>
+        <w:rPr>
+          <w:lang w:val="en-US"/>
+        </w:rPr>
+      </w:pPr>
+      <w:r>
+        <w:rPr>
+          <w:highlight w:val="yellow"/>
+          <w:lang w:val="en-US"/>
+        </w:rPr>
+        <w:t>PSP</w:t>
+      </w:r>
+      <w:r>
+        <w:rPr>
+          <w:lang w:val="en-US"/>
+        </w:rPr>
+        <w:t xml:space="preserve"> = </w:t>
+      </w:r>
+      <w:r>
+        <w:rPr>
+          <w:highlight w:val="green"/>
+          <w:lang w:val="en-US"/>
+        </w:rPr>
+        <w:t>PP</w:t>
+      </w:r>
+      <w:r>
+        <w:rPr>
+          <w:lang w:val="en-US"/>
+        </w:rPr>
+        <w:t xml:space="preserve"> * (</w:t>
+      </w:r>
+      <w:r>
+        <w:rPr>
+          <w:highlight w:val="cyan"/>
+          <w:lang w:val="en-US"/>
+        </w:rPr>
+        <w:t>T</w:t>
+      </w:r>
+      <w:r>
+        <w:rPr>
+          <w:lang w:val="en-US"/>
+        </w:rPr>
+        <w:t xml:space="preserve"> / </w:t>
+      </w:r>
+      <w:r>
+        <w:rPr>
+          <w:highlight w:val="magenta"/>
+          <w:lang w:val="en-US"/>
+        </w:rPr>
+        <w:t>TD</w:t>
+      </w:r>
+      <w:r>
+        <w:rPr>
+          <w:lang w:val="en-US"/>
+        </w:rPr>
+        <w:t>)</w:t>
+      </w:r>
+    </w:p>
+    <w:p>
+      <w:pPr>
+        <w:ind w:firstLine="0"/>
+        <w:rPr>
+          <w:lang w:val="en-US"/>
+        </w:rPr>
+      </w:pPr>
+      <w:r>
+        <w:rPr>
+          <w:lang w:val="en-US"/>
+        </w:rPr>
+        <w:t>Where:</w:t>
+      </w:r>
+    </w:p>
+    <w:p>
+      <w:pPr>
+        <w:ind w:firstLine="0"/>
+        <w:rPr>
+          <w:lang w:val="en-US"/>
+        </w:rPr>
+      </w:pPr>
+      <w:r>
+        <w:rPr>
+          <w:highlight w:val="yellow"/>
+          <w:lang w:val="en-US"/>
+        </w:rPr>
+        <w:t>PSP</w:t>
+      </w:r>
+      <w:r>
+        <w:rPr>
+          <w:lang w:val="en-US"/>
+        </w:rPr>
+        <w:t xml:space="preserve"> is the resulting preheat percentage used for the new puff.</w:t>
+      </w:r>
+    </w:p>
+    <w:p>
+      <w:pPr>
+        <w:ind w:firstLine="0"/>
+        <w:rPr>
+          <w:lang w:val="en-US"/>
+        </w:rPr>
+      </w:pPr>
+      <w:r>
+        <w:rPr>
+          <w:highlight w:val="green"/>
+          <w:lang w:val="en-US"/>
+        </w:rPr>
+        <w:t>PP</w:t>
+      </w:r>
+      <w:r>
+        <w:rPr>
+          <w:lang w:val="en-US"/>
+        </w:rPr>
+        <w:t xml:space="preserve"> is the configured Preheat (%).</w:t>
+      </w:r>
+    </w:p>
+    <w:p>
+      <w:pPr>
+        <w:ind w:firstLine="0"/>
+        <w:rPr>
+          <w:lang w:val="en-US"/>
+        </w:rPr>
+      </w:pPr>
+      <w:r>
+        <w:rPr>
+          <w:highlight w:val="cyan"/>
+          <w:lang w:val="en-US"/>
+        </w:rPr>
+        <w:t>T</w:t>
+      </w:r>
+      <w:r>
+        <w:rPr>
+          <w:lang w:val="en-US"/>
+        </w:rPr>
+        <w:t xml:space="preserve"> is the actual time since the last puff.</w:t>
+      </w:r>
+    </w:p>
+    <w:p>
+      <w:pPr>
+        <w:ind w:firstLine="0"/>
+        <w:rPr>
+          <w:lang w:val="en-US"/>
+        </w:rPr>
+      </w:pPr>
+      <w:r>
+        <w:rPr>
+          <w:highlight w:val="magenta"/>
+          <w:lang w:val="en-US"/>
+        </w:rPr>
+        <w:t>TD</w:t>
+      </w:r>
+      <w:r>
+        <w:rPr>
+          <w:lang w:val="en-US"/>
+        </w:rPr>
+        <w:t xml:space="preserve"> is the configured Preheat Delay.</w:t>
+      </w:r>
+    </w:p>
+    <w:p>
+      <w:pPr>
+        <w:ind w:firstLine="0"/>
+        <w:rPr>
+          <w:u w:val="single"/>
+          <w:lang w:val="en-US"/>
+        </w:rPr>
+      </w:pPr>
+      <w:r>
+        <w:rPr>
+          <w:lang w:val="en-US"/>
+        </w:rPr>
+        <w:t xml:space="preserve">  </w:t>
+      </w:r>
+      <w:r>
+        <w:rPr>
+          <w:u w:val="single"/>
+          <w:lang w:val="en-US"/>
+        </w:rPr>
+        <w:t>Example Configuration:</w:t>
+      </w:r>
+    </w:p>
+    <w:p>
+      <w:pPr>
+        <w:ind w:firstLine="0"/>
+        <w:rPr>
+          <w:lang w:val="en-US"/>
+        </w:rPr>
+      </w:pPr>
+      <w:r>
+        <w:rPr>
+          <w:lang w:val="en-US"/>
+        </w:rPr>
+        <w:t>P</w:t>
+      </w:r>
+      <w:r>
+        <w:rPr>
+          <w:lang w:val="en-US"/>
+        </w:rPr>
+        <w:t>ower (</w:t>
+      </w:r>
+      <w:r>
+        <w:rPr>
+          <w:color w:val="FF0000"/>
+          <w:lang w:val="en-US"/>
+        </w:rPr>
+        <w:t>P</w:t>
+      </w:r>
+      <w:r>
+        <w:rPr>
+          <w:lang w:val="en-US"/>
+        </w:rPr>
+        <w:t xml:space="preserve">) = 20 </w:t>
+      </w:r>
+      <w:r>
+        <w:rPr>
+          <w:color w:val="FF0000"/>
+          <w:lang w:val="en-US"/>
+        </w:rPr>
+        <w:t>W</w:t>
+      </w:r>
+    </w:p>
+    <w:p>
+      <w:pPr>
+        <w:ind w:firstLine="0"/>
+        <w:rPr>
+          <w:lang w:val="en-US"/>
+        </w:rPr>
+      </w:pPr>
+      <w:r>
+        <w:rPr>
+          <w:lang w:val="en-US"/>
+        </w:rPr>
+        <w:t>Preheat (</w:t>
+      </w:r>
+      <w:r>
+        <w:rPr>
+          <w:highlight w:val="green"/>
+          <w:lang w:val="en-US"/>
+        </w:rPr>
+        <w:t>PP</w:t>
+      </w:r>
+      <w:r>
+        <w:rPr>
+          <w:lang w:val="en-US"/>
+        </w:rPr>
+        <w:t>) = 150%</w:t>
+      </w:r>
+    </w:p>
+    <w:p>
+      <w:pPr>
+        <w:ind w:firstLine="0"/>
+        <w:rPr>
+          <w:lang w:val="en-US"/>
+        </w:rPr>
+      </w:pPr>
+      <w:r>
+        <w:rPr>
+          <w:lang w:val="en-US"/>
+        </w:rPr>
+        <w:t>Preheat Time (</w:t>
+      </w:r>
+      <w:r>
+        <w:rPr>
+          <w:color w:val="0070C0"/>
+          <w:lang w:val="en-US"/>
+        </w:rPr>
+        <w:t>TP</w:t>
+      </w:r>
+      <w:r>
+        <w:rPr>
+          <w:lang w:val="en-US"/>
+        </w:rPr>
+        <w:t>) = 1.0 s</w:t>
+      </w:r>
+    </w:p>
+    <w:p>
+      <w:pPr>
+        <w:ind w:firstLine="0"/>
+        <w:rPr>
+          <w:lang w:val="en-US"/>
+        </w:rPr>
+      </w:pPr>
+      <w:r>
+        <w:rPr>
+          <w:lang w:val="en-US"/>
+        </w:rPr>
+        <w:t>Preheat Delay (</w:t>
+      </w:r>
+      <w:r>
+        <w:rPr>
+          <w:highlight w:val="magenta"/>
+          <w:lang w:val="en-US"/>
+        </w:rPr>
+        <w:t>TD</w:t>
+      </w:r>
+      <w:r>
+        <w:rPr>
+          <w:lang w:val="en-US"/>
+        </w:rPr>
+        <w:t>) = 10 s</w:t>
+      </w:r>
+    </w:p>
+    <w:p>
+      <w:pPr>
+        <w:ind w:firstLine="0"/>
+        <w:rPr>
+          <w:u w:val="single"/>
+          <w:lang w:val="en-US"/>
+        </w:rPr>
+      </w:pPr>
+      <w:r>
+        <w:rPr>
+          <w:lang w:val="en-US"/>
+        </w:rPr>
+        <w:t xml:space="preserve">  </w:t>
+      </w:r>
+      <w:r>
+        <w:rPr>
+          <w:u w:val="single"/>
+          <w:lang w:val="en-US"/>
+        </w:rPr>
+        <w:t>Operation Example:</w:t>
+      </w:r>
+    </w:p>
+    <w:p>
+      <w:pPr>
+        <w:ind w:firstLine="0"/>
+        <w:rPr>
+          <w:lang w:val="en-US"/>
+        </w:rPr>
+      </w:pPr>
+      <w:r>
+        <w:rPr>
+          <w:lang w:val="en-US"/>
+        </w:rPr>
+        <w:t xml:space="preserve">First Puff: The preheat activates at full intensity. Power for the first second is 20 </w:t>
+      </w:r>
+      <w:r>
+        <w:rPr>
+          <w:color w:val="FF0000"/>
+          <w:lang w:val="en-US"/>
+        </w:rPr>
+        <w:t>W</w:t>
+      </w:r>
+      <w:r>
+        <w:rPr>
+          <w:lang w:val="en-US"/>
+        </w:rPr>
+        <w:t xml:space="preserve"> * 150% = 30 </w:t>
+      </w:r>
+      <w:r>
+        <w:rPr>
+          <w:color w:val="FF0000"/>
+          <w:lang w:val="en-US"/>
+        </w:rPr>
+        <w:t>W</w:t>
+      </w:r>
+      <w:r>
+        <w:rPr>
+          <w:lang w:val="en-US"/>
+        </w:rPr>
+        <w:t>.</w:t>
+      </w:r>
+    </w:p>
+    <w:p>
+      <w:pPr>
+        <w:ind w:firstLine="0"/>
+        <w:rPr>
+          <w:lang w:val="en-US"/>
+        </w:rPr>
+      </w:pPr>
+      <w:r>
+        <w:rPr>
+          <w:lang w:val="en-US"/>
+        </w:rPr>
+        <w:t>Second Puff after 5 seconds (</w:t>
+      </w:r>
+      <w:r>
+        <w:rPr>
+          <w:highlight w:val="cyan"/>
+          <w:lang w:val="en-US"/>
+        </w:rPr>
+        <w:t>T</w:t>
+      </w:r>
+      <w:r>
+        <w:rPr>
+          <w:lang w:val="en-US"/>
+        </w:rPr>
+        <w:t>):</w:t>
+      </w:r>
+    </w:p>
+    <w:p>
+      <w:pPr>
+        <w:ind w:firstLine="0"/>
+        <w:rPr>
+          <w:lang w:val="en-US"/>
+        </w:rPr>
+      </w:pPr>
+      <w:r>
+        <w:rPr>
+          <w:lang w:val="en-US"/>
+        </w:rPr>
+        <w:t xml:space="preserve">Since </w:t>
+      </w:r>
+      <w:r>
+        <w:rPr>
+          <w:highlight w:val="cyan"/>
+          <w:lang w:val="en-US"/>
+        </w:rPr>
+        <w:t>T</w:t>
+      </w:r>
+      <w:r>
+        <w:rPr>
+          <w:lang w:val="en-US"/>
+        </w:rPr>
+        <w:t xml:space="preserve"> (5 s) &lt; </w:t>
+      </w:r>
+      <w:r>
+        <w:rPr>
+          <w:highlight w:val="magenta"/>
+          <w:lang w:val="en-US"/>
+        </w:rPr>
+        <w:t>TD</w:t>
+      </w:r>
+      <w:r>
+        <w:rPr>
+          <w:lang w:val="en-US"/>
+        </w:rPr>
+        <w:t xml:space="preserve"> (10 s), Smart Preheat engages.</w:t>
+      </w:r>
+    </w:p>
+    <w:p>
+      <w:pPr>
+        <w:ind w:firstLine="0"/>
+        <w:rPr>
+          <w:lang w:val="ru-RU"/>
+        </w:rPr>
+      </w:pPr>
+      <w:r>
+        <w:rPr>
+          <w:lang w:val="en-US"/>
+        </w:rPr>
+        <w:t>The effective preheat percentage is calculated: 150% * (5 s / 10 s) = 75%.</w:t>
+      </w:r>
+    </w:p>
+    <w:p>
+      <w:pPr>
+        <w:ind w:firstLine="0"/>
+        <w:rPr>
+          <w:lang w:val="en-US"/>
+        </w:rPr>
+      </w:pPr>
+      <w:r>
+        <w:rPr>
+          <w:lang w:val="en-US"/>
+        </w:rPr>
+        <w:t xml:space="preserve">The resulting power for the first second of this puff is 20 </w:t>
+      </w:r>
+      <w:r>
+        <w:rPr>
+          <w:color w:val="FF0000"/>
+          <w:lang w:val="en-US"/>
+        </w:rPr>
+        <w:t xml:space="preserve">W </w:t>
+      </w:r>
+      <w:r>
+        <w:rPr>
+          <w:lang w:val="en-US"/>
+        </w:rPr>
+        <w:t xml:space="preserve">* 75% = 15 </w:t>
+      </w:r>
+      <w:r>
+        <w:rPr>
+          <w:color w:val="FF0000"/>
+          <w:lang w:val="en-US"/>
+        </w:rPr>
+        <w:t>W</w:t>
+      </w:r>
+      <w:r>
+        <w:rPr>
+          <w:lang w:val="en-US"/>
+        </w:rPr>
+        <w:t>.</w:t>
+      </w:r>
+    </w:p>
+    <w:p>
+      <w:pPr>
+        <w:ind w:firstLine="0"/>
+        <w:rPr>
+          <w:lang w:val="en-US"/>
+        </w:rPr>
+      </w:pPr>
+      <w:r>
+        <w:rPr>
+          <w:lang w:val="en-US"/>
+        </w:rPr>
+        <w:t>Third Puff after 15 seconds (</w:t>
+      </w:r>
+      <w:r>
+        <w:rPr>
+          <w:highlight w:val="cyan"/>
+          <w:lang w:val="en-US"/>
+        </w:rPr>
+        <w:t>T</w:t>
+      </w:r>
+      <w:r>
+        <w:rPr>
+          <w:lang w:val="en-US"/>
+        </w:rPr>
+        <w:t>):</w:t>
+      </w:r>
+    </w:p>
+    <w:p>
+      <w:pPr>
+        <w:ind w:firstLine="0"/>
+        <w:rPr>
+          <w:lang w:val="en-US"/>
+        </w:rPr>
+      </w:pPr>
+      <w:r>
+        <w:rPr>
+          <w:lang w:val="en-US"/>
+        </w:rPr>
+        <w:t xml:space="preserve">Since </w:t>
+      </w:r>
+      <w:r>
+        <w:rPr>
+          <w:highlight w:val="cyan"/>
+          <w:lang w:val="en-US"/>
+        </w:rPr>
+        <w:t>T</w:t>
+      </w:r>
+      <w:r>
+        <w:rPr>
+          <w:lang w:val="en-US"/>
+        </w:rPr>
+        <w:t xml:space="preserve"> (15 s) ≥ </w:t>
+      </w:r>
+      <w:r>
+        <w:rPr>
+          <w:highlight w:val="magenta"/>
+          <w:lang w:val="en-US"/>
+        </w:rPr>
+        <w:t>TD</w:t>
+      </w:r>
+      <w:r>
+        <w:rPr>
+          <w:lang w:val="en-US"/>
+        </w:rPr>
+        <w:t xml:space="preserve"> (10 s), preheat activates at the full configured 150%. Power for the first second is 30 </w:t>
+      </w:r>
+      <w:r>
+        <w:rPr>
+          <w:color w:val="FF0000"/>
+          <w:lang w:val="en-US"/>
+        </w:rPr>
+        <w:t>W</w:t>
+      </w:r>
+      <w:r>
+        <w:rPr>
+          <w:lang w:val="en-US"/>
+        </w:rPr>
+        <w:t>.</w:t>
+      </w:r>
+    </w:p>
+    <w:p>
+      <w:pPr>
+        <w:rPr>
+          <w:lang w:val="en-US"/>
+        </w:rPr>
+      </w:pPr>
+    </w:p>
+    <w:p>
+      <w:pPr>
+        <w:rPr>
+          <w:lang w:val="en-US"/>
+        </w:rPr>
+      </w:pPr>
+      <w:r>
+        <w:rPr>
+          <w:lang w:val="en-US"/>
+        </w:rPr>
+        <w:t>If no matches are found for the time-based adjustment, the preheat will operate at its standard configured values. When manually adjusting preheat settings, you will be prompted to confirm or save the changes to the active profile.</w:t>
+      </w:r>
+    </w:p>
+    <w:p>
+      <w:pPr>
+        <w:rPr>
+          <w:lang w:val="en-US"/>
+        </w:rPr>
+      </w:pPr>
     </w:p>
     <w:p>
       <w:pPr>
         <w:pStyle w:val="2"/>
+        <w:rPr>
+          <w:lang w:val="en-US"/>
+        </w:rPr>
       </w:pPr>
       <w:bookmarkStart w:id="20" w:name="_4kl6u4ma7vor" w:colFirst="0" w:colLast="0"/>
       <w:bookmarkEnd w:id="20"/>
       <w:r>
-        <w:t xml:space="preserve">4.3 </w:t>
-      </w:r>
-      <w:proofErr w:type="spellStart"/>
-      <w:r>
-        <w:t>Themes</w:t>
-      </w:r>
-      <w:proofErr w:type="spellEnd"/>
+        <w:rPr>
+          <w:lang w:val="en-US"/>
+        </w:rPr>
+        <w:t>4.3 Themes</w:t>
+      </w:r>
     </w:p>
     <w:p>
       <w:pPr>
         <w:jc w:val="center"/>
+        <w:rPr>
+          <w:lang w:val="en-US"/>
+        </w:rPr>
       </w:pPr>
       <w:r>
         <w:rPr>
@@ -10581,6 +11473,9 @@
         </w:drawing>
       </w:r>
       <w:r>
+        <w:rPr>
+          <w:lang w:val="en-US"/>
+        </w:rPr>
         <w:t xml:space="preserve"> </w:t>
       </w:r>
       <w:r>
@@ -10624,6 +11519,9 @@
         </w:drawing>
       </w:r>
       <w:r>
+        <w:rPr>
+          <w:lang w:val="en-US"/>
+        </w:rPr>
         <w:t xml:space="preserve"> </w:t>
       </w:r>
       <w:r>
@@ -10667,6 +11565,9 @@
         </w:drawing>
       </w:r>
       <w:r>
+        <w:rPr>
+          <w:lang w:val="en-US"/>
+        </w:rPr>
         <w:t xml:space="preserve"> </w:t>
       </w:r>
       <w:r>
@@ -10747,13 +11648,7 @@
         <w:rPr>
           <w:lang w:val="en-US"/>
         </w:rPr>
-        <w:t>Editing the main screen is different from the</w:t>
-      </w:r>
-      <w:r>
-        <w:rPr>
-          <w:lang w:val="en-US"/>
-        </w:rPr>
-        <w:t xml:space="preserve"> original </w:t>
+        <w:t xml:space="preserve">Editing the main screen is different from the original </w:t>
       </w:r>
       <w:proofErr w:type="spellStart"/>
       <w:r>
@@ -11154,7 +12049,6 @@
         <w:rPr>
           <w:lang w:val="en-US"/>
         </w:rPr>
-        <w:lastRenderedPageBreak/>
         <w:t>4.4 Hours</w:t>
       </w:r>
     </w:p>
@@ -11168,13 +12062,7 @@
         <w:rPr>
           <w:lang w:val="en-US"/>
         </w:rPr>
-        <w:t>The firmware supports timing with and without har</w:t>
-      </w:r>
-      <w:r>
-        <w:rPr>
-          <w:lang w:val="en-US"/>
-        </w:rPr>
-        <w:t xml:space="preserve">dware support. For more convenient use, you can enable time synchronization of the mod with your computer. To do this, right-click on the </w:t>
+        <w:t xml:space="preserve">The firmware supports timing with and without hardware support. For more convenient use, you can enable time synchronization of the mod with your computer. To do this, right-click on the </w:t>
       </w:r>
       <w:proofErr w:type="spellStart"/>
       <w:r>
@@ -11201,13 +12089,7 @@
         <w:rPr>
           <w:lang w:val="en-US"/>
         </w:rPr>
-        <w:t>The watch can be ope</w:t>
-      </w:r>
-      <w:r>
-        <w:rPr>
-          <w:lang w:val="en-US"/>
-        </w:rPr>
-        <w:t>rated in three timing modes:</w:t>
+        <w:t>The watch can be operated in three timing modes:</w:t>
       </w:r>
     </w:p>
     <w:p>
@@ -11249,33 +12131,20 @@
           <w:rFonts w:ascii="Arial Unicode MS" w:eastAsia="Arial Unicode MS" w:hAnsi="Arial Unicode MS" w:cs="Arial Unicode MS"/>
           <w:lang w:val="en-US"/>
         </w:rPr>
-        <w:t>- default RTC mode for mods without built-in quartz resonator. Time in sleep mode will be controlled by the internal LIRC oscillator. Due to the strong noise</w:t>
-      </w:r>
-      <w:r>
-        <w:rPr>
-          <w:rFonts w:ascii="Arial Unicode MS" w:eastAsia="Arial Unicode MS" w:hAnsi="Arial Unicode MS" w:cs="Arial Unicode MS"/>
-          <w:lang w:val="en-US"/>
-        </w:rPr>
-        <w:t xml:space="preserve"> of the oscillator, the timing will be inaccurate. However, you can adjust the average frequency (LIRC Speed) in Settings → Clock. The value will be unique for each mode.</w:t>
-      </w:r>
-    </w:p>
-    <w:p>
-      <w:pPr>
-        <w:rPr>
-          <w:lang w:val="en-US"/>
-        </w:rPr>
-      </w:pPr>
-      <w:r>
-        <w:rPr>
-          <w:lang w:val="en-US"/>
-        </w:rPr>
-        <w:t xml:space="preserve">Selection method: lower the value by 100, leave the mod for 30 minutes, then compare </w:t>
-      </w:r>
-      <w:r>
-        <w:rPr>
-          <w:lang w:val="en-US"/>
-        </w:rPr>
-        <w:t>the time. Selection of the optimal value is possible only by trial and error, but still will not guarantee an accurate clock. It is also possible to enable LSL mode, then frequency adjustment will not be required.</w:t>
+        <w:t>- default RTC mode for mods without built-in quartz resonator. Time in sleep mode will be controlled by the internal LIRC oscillator. Due to the strong noise of the oscillator, the timing will be inaccurate. However, you can adjust the average frequency (LIRC Speed) in Settings → Clock. The value will be unique for each mode.</w:t>
+      </w:r>
+    </w:p>
+    <w:p>
+      <w:pPr>
+        <w:rPr>
+          <w:lang w:val="en-US"/>
+        </w:rPr>
+      </w:pPr>
+      <w:r>
+        <w:rPr>
+          <w:lang w:val="en-US"/>
+        </w:rPr>
+        <w:t>Selection method: lower the value by 100, leave the mod for 30 minutes, then compare the time. Selection of the optimal value is possible only by trial and error, but still will not guarantee an accurate clock. It is also possible to enable LSL mode, then frequency adjustment will not be required.</w:t>
       </w:r>
     </w:p>
     <w:p>
@@ -11295,19 +12164,7 @@
         <w:rPr>
           <w:lang w:val="en-US"/>
         </w:rPr>
-        <w:t>(Light Sleep Mode) is a light sleep mo</w:t>
-      </w:r>
-      <w:r>
-        <w:rPr>
-          <w:lang w:val="en-US"/>
-        </w:rPr>
-        <w:t>de. When the device is turned off, it goes to sleep, but not completely. The central processor remains on, which ensures correct clock running, while the battery is discharged by about 0.1-0.2 volts per day on single-battery devices. At all other settings,</w:t>
-      </w:r>
-      <w:r>
-        <w:rPr>
-          <w:lang w:val="en-US"/>
-        </w:rPr>
-        <w:t xml:space="preserve"> the clock has no effect on power consumption. The enabled LSL mode is warned by a "!" next to the battery or the letter "L" in the foxy theme. </w:t>
+        <w:t xml:space="preserve">(Light Sleep Mode) is a light sleep mode. When the device is turned off, it goes to sleep, but not completely. The central processor remains on, which ensures correct clock running, while the battery is discharged by about 0.1-0.2 volts per day on single-battery devices. At all other settings, the clock has no effect on power consumption. The enabled LSL mode is warned by a "!" next to the battery or the letter "L" in the foxy theme. </w:t>
       </w:r>
     </w:p>
     <w:p>
@@ -11323,14 +12180,7 @@
           <w:i/>
           <w:lang w:val="en-US"/>
         </w:rPr>
-        <w:t xml:space="preserve">Note: after switching the RTC mode, disconnect the USB and reboot your mod by removing the batteries for about </w:t>
-      </w:r>
-      <w:r>
-        <w:rPr>
-          <w:i/>
-          <w:lang w:val="en-US"/>
-        </w:rPr>
-        <w:t>30 seconds. If you fail to start the RTC module in LXT mode, the mode will automatically switch to LIRC/LSL, which may indicate a hardware problem or a missing crystal resonator on your mod's board.</w:t>
+        <w:t>Note: after switching the RTC mode, disconnect the USB and reboot your mod by removing the batteries for about 30 seconds. If you fail to start the RTC module in LXT mode, the mode will automatically switch to LIRC/LSL, which may indicate a hardware problem or a missing crystal resonator on your mod's board.</w:t>
       </w:r>
     </w:p>
     <w:p>
@@ -11354,21 +12204,7 @@
           <w:i/>
           <w:lang w:val="en-US"/>
         </w:rPr>
-        <w:t>: in LSL mode, the battery over-discharge protecti</w:t>
-      </w:r>
-      <w:r>
-        <w:rPr>
-          <w:i/>
-          <w:lang w:val="en-US"/>
-        </w:rPr>
-        <w:t>on does not work and the voltage may drop below the permissible threshold. Keep an eye on battery discharge yourself if you leave the box in standby mode for a long time with LSL enabled. We recommend removing the batteries if you do not use the mod for se</w:t>
-      </w:r>
-      <w:r>
-        <w:rPr>
-          <w:i/>
-          <w:lang w:val="en-US"/>
-        </w:rPr>
-        <w:t>veral days.</w:t>
+        <w:t>: in LSL mode, the battery over-discharge protection does not work and the voltage may drop below the permissible threshold. Keep an eye on battery discharge yourself if you leave the box in standby mode for a long time with LSL enabled. We recommend removing the batteries if you do not use the mod for several days.</w:t>
       </w:r>
     </w:p>
     <w:p>
@@ -11427,13 +12263,7 @@
         <w:rPr>
           <w:lang w:val="en-US"/>
         </w:rPr>
-        <w:t>.) and cur</w:t>
-      </w:r>
-      <w:r>
-        <w:rPr>
-          <w:lang w:val="en-US"/>
-        </w:rPr>
-        <w:t>rent up to 2.1 A. To start charging, open this item in the main menu, place the RC adapter on the mod, connect the device and press</w:t>
+        <w:t>.) and current up to 2.1 A. To start charging, open this item in the main menu, place the RC adapter on the mod, connect the device and press</w:t>
       </w:r>
       <w:r>
         <w:rPr>
@@ -11479,13 +12309,7 @@
         <w:rPr>
           <w:lang w:val="en-US"/>
         </w:rPr>
-        <w:t xml:space="preserve"> . Power Bank mode has a function of automatic shutdown when the supplied current does not exceed 50 mA (indicated by blinki</w:t>
-      </w:r>
-      <w:r>
-        <w:rPr>
-          <w:lang w:val="en-US"/>
-        </w:rPr>
-        <w:t>ng "On").</w:t>
+        <w:t xml:space="preserve"> . Power Bank mode has a function of automatic shutdown when the supplied current does not exceed 50 mA (indicated by blinking "On").</w:t>
       </w:r>
     </w:p>
     <w:p>
@@ -11890,13 +12714,7 @@
         <w:rPr>
           <w:lang w:val="en-US"/>
         </w:rPr>
-        <w:t>). When stealth mode is active,</w:t>
-      </w:r>
-      <w:r>
-        <w:rPr>
-          <w:lang w:val="en-US"/>
-        </w:rPr>
-        <w:t xml:space="preserve"> the screen is off by default. To turn the screen on, click</w:t>
+        <w:t>). When stealth mode is active, the screen is off by default. To turn the screen on, click</w:t>
       </w:r>
       <w:r>
         <w:rPr>
@@ -11948,7 +12766,6 @@
         <w:rPr>
           <w:noProof/>
         </w:rPr>
-        <w:lastRenderedPageBreak/>
         <w:drawing>
           <wp:inline distT="114300" distB="114300" distL="114300" distR="114300" wp14:anchorId="6F149B7D" wp14:editId="049DF8DC">
             <wp:extent cx="304800" cy="133350"/>
@@ -11989,13 +12806,7 @@
         <w:rPr>
           <w:lang w:val="en-US"/>
         </w:rPr>
-        <w:t xml:space="preserve"> (puff) or when the fade delay expires, the screen will turn off again. Also, by default, the charging screen and screen saver are not displayed in stealth mode, b</w:t>
-      </w:r>
-      <w:r>
-        <w:rPr>
-          <w:lang w:val="en-US"/>
-        </w:rPr>
-        <w:t xml:space="preserve">ut can be enabled in the "Stealth" section of the </w:t>
+        <w:t xml:space="preserve"> (puff) or when the fade delay expires, the screen will turn off again. Also, by default, the charging screen and screen saver are not displayed in stealth mode, but can be enabled in the "Stealth" section of the </w:t>
       </w:r>
       <w:hyperlink w:anchor="_4o24xvsgg1uo">
         <w:r>
@@ -12070,14 +12881,7 @@
           <w:i/>
           <w:lang w:val="en-US"/>
         </w:rPr>
-        <w:t xml:space="preserve"> AIO, Pico RDTA, Sinuous P80), the backlight is o</w:t>
-      </w:r>
-      <w:r>
-        <w:rPr>
-          <w:i/>
-          <w:lang w:val="en-US"/>
-        </w:rPr>
-        <w:t>ff in stealth mode.</w:t>
+        <w:t xml:space="preserve"> AIO, Pico RDTA, Sinuous P80), the backlight is off in stealth mode.</w:t>
       </w:r>
       <w:r>
         <w:rPr>
@@ -12099,7 +12903,6 @@
         <w:rPr>
           <w:lang w:val="en-US"/>
         </w:rPr>
-        <w:lastRenderedPageBreak/>
         <w:t xml:space="preserve">5. </w:t>
       </w:r>
       <w:proofErr w:type="spellStart"/>
@@ -12206,13 +13009,7 @@
         <w:rPr>
           <w:lang w:val="en-US"/>
         </w:rPr>
-        <w:t>is a configurato</w:t>
-      </w:r>
-      <w:r>
-        <w:rPr>
-          <w:lang w:val="en-US"/>
-        </w:rPr>
-        <w:t xml:space="preserve">r that allows you to fully customize your box mod from your computer, as well as reset settings or save them backed up in a configuration file. </w:t>
+        <w:t xml:space="preserve">is a configurator that allows you to fully customize your box mod from your computer, as well as reset settings or save them backed up in a configuration file. </w:t>
       </w:r>
       <w:proofErr w:type="spellStart"/>
       <w:r>
@@ -12293,13 +13090,7 @@
         <w:rPr>
           <w:lang w:val="en-US"/>
         </w:rPr>
-        <w:t>- tracks all sensors of the box mod in real time</w:t>
-      </w:r>
-      <w:r>
-        <w:rPr>
-          <w:lang w:val="en-US"/>
-        </w:rPr>
-        <w:t>. Allows you to record sensor readings and save them as a .csv table.</w:t>
+        <w:t>- tracks all sensors of the box mod in real time. Allows you to record sensor readings and save them as a .csv table.</w:t>
       </w:r>
     </w:p>
     <w:p>
@@ -12341,13 +13132,7 @@
         <w:rPr>
           <w:lang w:val="en-US"/>
         </w:rPr>
-        <w:t>- used to update the device software. Also shows the software and board version, allows to</w:t>
-      </w:r>
-      <w:r>
-        <w:rPr>
-          <w:lang w:val="en-US"/>
-        </w:rPr>
-        <w:t xml:space="preserve"> reset and write </w:t>
+        <w:t xml:space="preserve">- used to update the device software. Also shows the software and board version, allows to reset and write </w:t>
       </w:r>
       <w:proofErr w:type="spellStart"/>
       <w:r>
@@ -12482,7 +13267,6 @@
         <w:rPr>
           <w:lang w:val="en-US"/>
         </w:rPr>
-        <w:lastRenderedPageBreak/>
         <w:t xml:space="preserve">6. </w:t>
       </w:r>
       <w:proofErr w:type="spellStart"/>
@@ -12518,41 +13302,31 @@
         <w:rPr>
           <w:lang w:val="en-US"/>
         </w:rPr>
-        <w:t xml:space="preserve"> and its subsidiaries. The firmware is created with the idea of safe use of box </w:t>
-      </w:r>
-      <w:r>
-        <w:rPr>
-          <w:lang w:val="en-US"/>
-        </w:rPr>
-        <w:t>mod with its maximum control. Provides a wide range of simple and complex customization options:</w:t>
+        <w:t xml:space="preserve"> and its subsidiaries. The firmware is created with the idea of safe use of box mod with its maximum control. Provides a wide range of simple and complex customization options:</w:t>
       </w:r>
     </w:p>
     <w:p>
       <w:pPr>
         <w:pStyle w:val="2"/>
+        <w:rPr>
+          <w:lang w:val="en-US"/>
+        </w:rPr>
       </w:pPr>
       <w:bookmarkStart w:id="27" w:name="_nksklresf2ja" w:colFirst="0" w:colLast="0"/>
       <w:bookmarkEnd w:id="27"/>
       <w:r>
-        <w:t xml:space="preserve">6.1 </w:t>
-      </w:r>
-      <w:proofErr w:type="spellStart"/>
-      <w:r>
-        <w:t>Main</w:t>
-      </w:r>
-      <w:proofErr w:type="spellEnd"/>
-      <w:r>
-        <w:t xml:space="preserve"> </w:t>
-      </w:r>
-      <w:proofErr w:type="spellStart"/>
-      <w:r>
-        <w:t>menu</w:t>
-      </w:r>
-      <w:proofErr w:type="spellEnd"/>
+        <w:rPr>
+          <w:lang w:val="en-US"/>
+        </w:rPr>
+        <w:t>6.1 Main menu</w:t>
+      </w:r>
     </w:p>
     <w:p>
       <w:pPr>
         <w:jc w:val="center"/>
+        <w:rPr>
+          <w:lang w:val="en-US"/>
+        </w:rPr>
       </w:pPr>
       <w:r>
         <w:rPr>
@@ -12595,6 +13369,9 @@
         </w:drawing>
       </w:r>
       <w:r>
+        <w:rPr>
+          <w:lang w:val="en-US"/>
+        </w:rPr>
         <w:t xml:space="preserve"> </w:t>
       </w:r>
       <w:r>
@@ -13420,10 +14197,7 @@
       </w:r>
       <w:proofErr w:type="spellStart"/>
       <w:r>
-        <w:t>setu</w:t>
-      </w:r>
-      <w:r>
-        <w:t>p</w:t>
+        <w:t>setup</w:t>
       </w:r>
       <w:proofErr w:type="spellEnd"/>
       <w:r>
@@ -13884,7 +14658,6 @@
         <w:rPr>
           <w:b/>
         </w:rPr>
-        <w:lastRenderedPageBreak/>
         <w:t>Clock</w:t>
       </w:r>
       <w:proofErr w:type="spellEnd"/>
@@ -13982,14 +14755,7 @@
           <w:b/>
           <w:lang w:val="en-US"/>
         </w:rPr>
-        <w:t>save</w:t>
-      </w:r>
-      <w:r>
-        <w:rPr>
-          <w:b/>
-          <w:lang w:val="en-US"/>
-        </w:rPr>
-        <w:t xml:space="preserve">r </w:t>
+        <w:t xml:space="preserve">saver </w:t>
       </w:r>
       <w:r>
         <w:rPr>
@@ -14364,13 +15130,7 @@
         <w:rPr>
           <w:lang w:val="en-US"/>
         </w:rPr>
-        <w:t xml:space="preserve">- </w:t>
-      </w:r>
-      <w:r>
-        <w:rPr>
-          <w:lang w:val="en-US"/>
-        </w:rPr>
-        <w:t>screen settings in stealth mode:</w:t>
+        <w:t>- screen settings in stealth mode:</w:t>
       </w:r>
     </w:p>
     <w:p>
@@ -14497,13 +15257,7 @@
         <w:rPr>
           <w:lang w:val="en-US"/>
         </w:rPr>
-        <w:t xml:space="preserve"> button </w:t>
-      </w:r>
-      <w:r>
-        <w:rPr>
-          <w:lang w:val="en-US"/>
-        </w:rPr>
-        <w:t>if it is enabled on the main screen;</w:t>
+        <w:t xml:space="preserve"> button if it is enabled on the main screen;</w:t>
       </w:r>
     </w:p>
     <w:p>
@@ -14973,13 +15727,7 @@
         <w:rPr>
           <w:lang w:val="en-US"/>
         </w:rPr>
-        <w:t xml:space="preserve">- maximum number of puffs or </w:t>
-      </w:r>
-      <w:r>
-        <w:rPr>
-          <w:lang w:val="en-US"/>
-        </w:rPr>
-        <w:t>vaporization time before the device locks/unlocks (depending on the 5 Clicks setting), to change units hold</w:t>
+        <w:t>- maximum number of puffs or vaporization time before the device locks/unlocks (depending on the 5 Clicks setting), to change units hold</w:t>
       </w:r>
       <w:r>
         <w:rPr>
@@ -15283,13 +16031,7 @@
         <w:rPr>
           <w:lang w:val="en-US"/>
         </w:rPr>
-        <w:t>- Ed</w:t>
-      </w:r>
-      <w:r>
-        <w:rPr>
-          <w:lang w:val="en-US"/>
-        </w:rPr>
-        <w:t xml:space="preserve">it the main screen, the equivalent of 3 </w:t>
+        <w:t xml:space="preserve">- Edit the main screen, the equivalent of 3 </w:t>
       </w:r>
       <w:proofErr w:type="spellStart"/>
       <w:r>
@@ -15359,7 +16101,6 @@
         <w:rPr>
           <w:b/>
         </w:rPr>
-        <w:lastRenderedPageBreak/>
         <w:t>Profiles</w:t>
       </w:r>
       <w:proofErr w:type="spellEnd"/>
@@ -15434,13 +16175,7 @@
         <w:rPr>
           <w:lang w:val="en-US"/>
         </w:rPr>
-        <w:t xml:space="preserve"> - display the statistics screen with the</w:t>
-      </w:r>
-      <w:r>
-        <w:rPr>
-          <w:lang w:val="en-US"/>
-        </w:rPr>
-        <w:t xml:space="preserve"> option to reset counters;</w:t>
+        <w:t xml:space="preserve"> - display the statistics screen with the option to reset counters;</w:t>
       </w:r>
     </w:p>
     <w:p>
@@ -15774,13 +16509,7 @@
         <w:rPr>
           <w:lang w:val="en-US"/>
         </w:rPr>
-        <w:t xml:space="preserve"> - </w:t>
-      </w:r>
-      <w:r>
-        <w:rPr>
-          <w:lang w:val="en-US"/>
-        </w:rPr>
-        <w:t>switches the mod to Power Bank mode;</w:t>
+        <w:t xml:space="preserve"> - switches the mod to Power Bank mode;</w:t>
       </w:r>
     </w:p>
     <w:p>
@@ -16072,13 +16801,7 @@
         <w:rPr>
           <w:lang w:val="en-US"/>
         </w:rPr>
-        <w:t xml:space="preserve"> - enable/disable mod lock (all buttons are locked, but the mo</w:t>
-      </w:r>
-      <w:r>
-        <w:rPr>
-          <w:lang w:val="en-US"/>
-        </w:rPr>
-        <w:t>d remains enabled);</w:t>
+        <w:t xml:space="preserve"> - enable/disable mod lock (all buttons are locked, but the mod remains enabled);</w:t>
       </w:r>
     </w:p>
     <w:p>
@@ -16260,13 +16983,7 @@
         <w:rPr>
           <w:lang w:val="en-US"/>
         </w:rPr>
-        <w:t>- sets</w:t>
-      </w:r>
-      <w:r>
-        <w:rPr>
-          <w:lang w:val="en-US"/>
-        </w:rPr>
-        <w:t xml:space="preserve"> the behavior of Smart mode;</w:t>
+        <w:t>- sets the behavior of Smart mode;</w:t>
       </w:r>
     </w:p>
     <w:p>
@@ -16457,14 +17174,7 @@
           <w:b/>
           <w:lang w:val="en-US"/>
         </w:rPr>
-        <w:t>Ti</w:t>
-      </w:r>
-      <w:r>
-        <w:rPr>
-          <w:b/>
-          <w:lang w:val="en-US"/>
-        </w:rPr>
-        <w:t xml:space="preserve">me </w:t>
+        <w:t xml:space="preserve">Time </w:t>
       </w:r>
       <w:r>
         <w:rPr>
@@ -16524,21 +17234,25 @@
       <w:pPr>
         <w:pStyle w:val="3"/>
         <w:ind w:firstLine="0"/>
+        <w:rPr>
+          <w:lang w:val="en-US"/>
+        </w:rPr>
       </w:pPr>
       <w:bookmarkStart w:id="31" w:name="_ecua7hu1qrnb" w:colFirst="0" w:colLast="0"/>
       <w:bookmarkEnd w:id="31"/>
       <w:r>
-        <w:t xml:space="preserve">6.4.1 Advanced </w:t>
-      </w:r>
-      <w:proofErr w:type="spellStart"/>
-      <w:r>
-        <w:t>settings</w:t>
-      </w:r>
-      <w:proofErr w:type="spellEnd"/>
+        <w:rPr>
+          <w:lang w:val="en-US"/>
+        </w:rPr>
+        <w:t>6.4.1 Advanced settings</w:t>
+      </w:r>
     </w:p>
     <w:p>
       <w:pPr>
         <w:jc w:val="center"/>
+        <w:rPr>
+          <w:lang w:val="en-US"/>
+        </w:rPr>
       </w:pPr>
       <w:r>
         <w:rPr>
@@ -16701,6 +17415,9 @@
         </w:drawing>
       </w:r>
       <w:r>
+        <w:rPr>
+          <w:lang w:val="en-US"/>
+        </w:rPr>
         <w:t xml:space="preserve">    </w:t>
       </w:r>
       <w:r>
@@ -16788,13 +17505,7 @@
         <w:rPr>
           <w:lang w:val="en-US"/>
         </w:rPr>
-        <w:t>- setting the cha</w:t>
-      </w:r>
-      <w:r>
-        <w:rPr>
-          <w:lang w:val="en-US"/>
-        </w:rPr>
-        <w:t>rging behavior of the mod:</w:t>
+        <w:t>- setting the charging behavior of the mod:</w:t>
       </w:r>
     </w:p>
     <w:p>
@@ -16845,7 +17556,6 @@
           <w:b/>
           <w:lang w:val="en-US"/>
         </w:rPr>
-        <w:lastRenderedPageBreak/>
         <w:t xml:space="preserve">Charge </w:t>
       </w:r>
       <w:r>
@@ -16932,13 +17642,7 @@
         <w:rPr>
           <w:lang w:val="en-US"/>
         </w:rPr>
-        <w:t>- correction of the measuring shunt value - adjusting t</w:t>
-      </w:r>
-      <w:r>
-        <w:rPr>
-          <w:lang w:val="en-US"/>
-        </w:rPr>
-        <w:t>he ohmmeter of the mod for more accurate readings;</w:t>
+        <w:t>- correction of the measuring shunt value - adjusting the ohmmeter of the mod for more accurate readings;</w:t>
       </w:r>
     </w:p>
     <w:p>
@@ -17022,13 +17726,7 @@
         <w:rPr>
           <w:lang w:val="en-US"/>
         </w:rPr>
-        <w:t xml:space="preserve">- deep sleep setting (transition after 3 </w:t>
-      </w:r>
-      <w:r>
-        <w:rPr>
-          <w:lang w:val="en-US"/>
-        </w:rPr>
-        <w:t xml:space="preserve">minutes of inactivity by default, delay can be set with </w:t>
+        <w:t xml:space="preserve">- deep sleep setting (transition after 3 minutes of inactivity by default, delay can be set with </w:t>
       </w:r>
       <w:proofErr w:type="spellStart"/>
       <w:r>
@@ -17229,13 +17927,7 @@
         <w:rPr>
           <w:lang w:val="en-US"/>
         </w:rPr>
-        <w:t xml:space="preserve">- board temperature </w:t>
-      </w:r>
-      <w:r>
-        <w:rPr>
-          <w:lang w:val="en-US"/>
-        </w:rPr>
-        <w:t>sensor, Ext - external (thermistor), Int - embedded (microcontroller);</w:t>
+        <w:t>- board temperature sensor, Ext - external (thermistor), Int - embedded (microcontroller);</w:t>
       </w:r>
     </w:p>
     <w:p>
@@ -17414,14 +18106,7 @@
         <w:rPr>
           <w:lang w:val="en-US"/>
         </w:rPr>
-        <w:lastRenderedPageBreak/>
-        <w:t xml:space="preserve">7. </w:t>
-      </w:r>
-      <w:r>
-        <w:rPr>
-          <w:lang w:val="en-US"/>
-        </w:rPr>
-        <w:t>Addressing common problems</w:t>
+        <w:t>7. Addressing common problems</w:t>
       </w:r>
     </w:p>
     <w:p>
@@ -17463,13 +18148,7 @@
         <w:rPr>
           <w:lang w:val="en-US"/>
         </w:rPr>
-        <w:t xml:space="preserve">For example, you </w:t>
-      </w:r>
-      <w:r>
-        <w:rPr>
-          <w:lang w:val="en-US"/>
-        </w:rPr>
-        <w:t xml:space="preserve">have noticed that when charging the batteries in the </w:t>
+        <w:t xml:space="preserve">For example, you have noticed that when charging the batteries in the </w:t>
       </w:r>
       <w:proofErr w:type="spellStart"/>
       <w:r>
@@ -17496,32 +18175,20 @@
         <w:rPr>
           <w:lang w:val="en-US"/>
         </w:rPr>
-        <w:t>However, when measuring the voltage with a tester or in an external charger, both batteri</w:t>
-      </w:r>
-      <w:r>
-        <w:rPr>
-          <w:lang w:val="en-US"/>
-        </w:rPr>
-        <w:t>es have the same voltage of 4.05V and 4.05V respectively.</w:t>
-      </w:r>
-    </w:p>
-    <w:p>
-      <w:pPr>
-        <w:rPr>
-          <w:lang w:val="en-US"/>
-        </w:rPr>
-      </w:pPr>
-      <w:r>
-        <w:rPr>
-          <w:lang w:val="en-US"/>
-        </w:rPr>
-        <w:t xml:space="preserve">In this case, BVO correction is necessary. Charge the batteries in an external charger, it is very desirable that they were identical, "married", it will facilitate calibration. Measure the voltage </w:t>
-      </w:r>
-      <w:r>
-        <w:rPr>
-          <w:lang w:val="en-US"/>
-        </w:rPr>
-        <w:t>on the batteries with a tester, set them in the mod and, by correcting the BVO, achieve correct readings in the monitor or on the information screen.</w:t>
+        <w:t>However, when measuring the voltage with a tester or in an external charger, both batteries have the same voltage of 4.05V and 4.05V respectively.</w:t>
+      </w:r>
+    </w:p>
+    <w:p>
+      <w:pPr>
+        <w:rPr>
+          <w:lang w:val="en-US"/>
+        </w:rPr>
+      </w:pPr>
+      <w:r>
+        <w:rPr>
+          <w:lang w:val="en-US"/>
+        </w:rPr>
+        <w:t>In this case, BVO correction is necessary. Charge the batteries in an external charger, it is very desirable that they were identical, "married", it will facilitate calibration. Measure the voltage on the batteries with a tester, set them in the mod and, by correcting the BVO, achieve correct readings in the monitor or on the information screen.</w:t>
       </w:r>
     </w:p>
     <w:p>
@@ -17535,14 +18202,7 @@
           <w:i/>
           <w:lang w:val="en-US"/>
         </w:rPr>
-        <w:t>Note: Many mods have a non-linear ADC characteristic, which results in noticeable differences in the corre</w:t>
-      </w:r>
-      <w:r>
-        <w:rPr>
-          <w:i/>
-          <w:lang w:val="en-US"/>
-        </w:rPr>
-        <w:t xml:space="preserve">ctness of measurements depending on voltage. </w:t>
+        <w:t xml:space="preserve">Note: Many mods have a non-linear ADC characteristic, which results in noticeable differences in the correctness of measurements depending on voltage. </w:t>
       </w:r>
       <w:r>
         <w:rPr>
@@ -17652,14 +18312,7 @@
           <w:i/>
           <w:lang w:val="en-US"/>
         </w:rPr>
-        <w:t>if you are charging batteries in the mod, calibrate the BVO with fully charged batteries (ideally freshly removed from an external charger at the end of a ful</w:t>
-      </w:r>
-      <w:r>
-        <w:rPr>
-          <w:i/>
-          <w:lang w:val="en-US"/>
-        </w:rPr>
-        <w:t>l charge);</w:t>
+        <w:t>if you are charging batteries in the mod, calibrate the BVO with fully charged batteries (ideally freshly removed from an external charger at the end of a full charge);</w:t>
       </w:r>
     </w:p>
     <w:p>
@@ -17723,32 +18376,20 @@
         <w:rPr>
           <w:lang w:val="en-US"/>
         </w:rPr>
-        <w:t>The firmware implements the ability to adjust the battery charging current to avoid excessive heating of the mod and to protec</w:t>
-      </w:r>
-      <w:r>
-        <w:rPr>
-          <w:lang w:val="en-US"/>
-        </w:rPr>
-        <w:t>t the external power supply from overloading. This setting works only on multi-battery mods and Pico 25.</w:t>
-      </w:r>
-    </w:p>
-    <w:p>
-      <w:pPr>
-        <w:rPr>
-          <w:lang w:val="en-US"/>
-        </w:rPr>
-      </w:pPr>
-      <w:r>
-        <w:rPr>
-          <w:lang w:val="en-US"/>
-        </w:rPr>
-        <w:t xml:space="preserve">The input current is adjusted in the </w:t>
-      </w:r>
-      <w:r>
-        <w:rPr>
-          <w:lang w:val="en-US"/>
-        </w:rPr>
-        <w:t xml:space="preserve">Advanced section of the firmware settings or in the </w:t>
+        <w:t>The firmware implements the ability to adjust the battery charging current to avoid excessive heating of the mod and to protect the external power supply from overloading. This setting works only on multi-battery mods and Pico 25.</w:t>
+      </w:r>
+    </w:p>
+    <w:p>
+      <w:pPr>
+        <w:rPr>
+          <w:lang w:val="en-US"/>
+        </w:rPr>
+      </w:pPr>
+      <w:r>
+        <w:rPr>
+          <w:lang w:val="en-US"/>
+        </w:rPr>
+        <w:t xml:space="preserve">The input current is adjusted in the Advanced section of the firmware settings or in the </w:t>
       </w:r>
       <w:proofErr w:type="spellStart"/>
       <w:r>
@@ -17806,13 +18447,7 @@
         <w:rPr>
           <w:lang w:val="en-US"/>
         </w:rPr>
-        <w:t>Safe mode boots your device into recovery mode, which is used to recover from a fail</w:t>
-      </w:r>
-      <w:r>
-        <w:rPr>
-          <w:lang w:val="en-US"/>
-        </w:rPr>
-        <w:t>ed firmware installation and verify that the device is working properly. More specifically, it is the boot loader that is used to load the firmware. Each device has its own boot loader, which is not changed during firmware installation.</w:t>
+        <w:t>Safe mode boots your device into recovery mode, which is used to recover from a failed firmware installation and verify that the device is working properly. More specifically, it is the boot loader that is used to load the firmware. Each device has its own boot loader, which is not changed during firmware installation.</w:t>
       </w:r>
     </w:p>
     <w:p>
@@ -17999,13 +18634,7 @@
         <w:rPr>
           <w:lang w:val="en-US"/>
         </w:rPr>
-        <w:t xml:space="preserve">connect the </w:t>
-      </w:r>
-      <w:r>
-        <w:rPr>
-          <w:lang w:val="en-US"/>
-        </w:rPr>
-        <w:t>device to a PC;</w:t>
+        <w:t>connect the device to a PC;</w:t>
       </w:r>
     </w:p>
     <w:p>
@@ -18085,7 +18714,6 @@
         <w:rPr>
           <w:lang w:val="en-US"/>
         </w:rPr>
-        <w:lastRenderedPageBreak/>
         <w:t>briefly press the Reset button on the device (see the user manual for the device);</w:t>
       </w:r>
     </w:p>
@@ -18177,14 +18805,7 @@
           <w:b/>
           <w:lang w:val="en-US"/>
         </w:rPr>
-        <w:t>How do I know</w:t>
-      </w:r>
-      <w:r>
-        <w:rPr>
-          <w:b/>
-          <w:lang w:val="en-US"/>
-        </w:rPr>
-        <w:t xml:space="preserve"> if the device is in safe mode?</w:t>
+        <w:t>How do I know if the device is in safe mode?</w:t>
       </w:r>
     </w:p>
     <w:p>
@@ -18450,13 +19071,7 @@
         <w:rPr>
           <w:lang w:val="en-US"/>
         </w:rPr>
-        <w:t>, go to the</w:t>
-      </w:r>
-      <w:r>
-        <w:rPr>
-          <w:lang w:val="en-US"/>
-        </w:rPr>
-        <w:t xml:space="preserve"> firmware update and set your board version in the "Expert" tab.</w:t>
+        <w:t>, go to the firmware update and set your board version in the "Expert" tab.</w:t>
       </w:r>
     </w:p>
     <w:p>
@@ -18480,19 +19095,7 @@
         <w:rPr>
           <w:lang w:val="en-US"/>
         </w:rPr>
-        <w:t>7</w:t>
-      </w:r>
-      <w:r>
-        <w:rPr>
-          <w:lang w:val="en-US"/>
-        </w:rPr>
-        <w:t xml:space="preserve">.6 </w:t>
-      </w:r>
-      <w:r>
-        <w:rPr>
-          <w:lang w:val="en-US"/>
-        </w:rPr>
-        <w:t>Extended error statuses</w:t>
+        <w:t>7.6 Extended error statuses</w:t>
       </w:r>
     </w:p>
     <w:p>
@@ -18544,13 +19147,7 @@
         <w:rPr>
           <w:lang w:val="en-US"/>
         </w:rPr>
-        <w:t>is the error code) that will help you solve some problems on your own or facil</w:t>
-      </w:r>
-      <w:r>
-        <w:rPr>
-          <w:lang w:val="en-US"/>
-        </w:rPr>
-        <w:t>itate diagnosis.</w:t>
+        <w:t>is the error code) that will help you solve some problems on your own or facilitate diagnosis.</w:t>
       </w:r>
     </w:p>
     <w:p>
@@ -18756,19 +19353,7 @@
         <w:rPr>
           <w:lang w:val="en-US"/>
         </w:rPr>
-        <w:t>- a</w:t>
-      </w:r>
-      <w:r>
-        <w:rPr>
-          <w:lang w:val="en-US"/>
-        </w:rPr>
-        <w:t>tomizer current is exceeded. It can appear in case of incorrectly measured (overestimated) resistance when screwing on the atomizer, as well as in case of hardware problems (poor quality connections of the power part, insufficiently good fixing of the coil</w:t>
-      </w:r>
-      <w:r>
-        <w:rPr>
-          <w:lang w:val="en-US"/>
-        </w:rPr>
-        <w:t>, etc.). One of the symptoms leading to this error is that the displayed resistance of the atomizer drops when you press</w:t>
+        <w:t>- atomizer current is exceeded. It can appear in case of incorrectly measured (overestimated) resistance when screwing on the atomizer, as well as in case of hardware problems (poor quality connections of the power part, insufficiently good fixing of the coil, etc.). One of the symptoms leading to this error is that the displayed resistance of the atomizer drops when you press</w:t>
       </w:r>
       <w:r>
         <w:rPr>
@@ -18864,13 +19449,7 @@
         <w:rPr>
           <w:lang w:val="en-US"/>
         </w:rPr>
-        <w:t xml:space="preserve">- resistance dropped </w:t>
-      </w:r>
-      <w:r>
-        <w:rPr>
-          <w:lang w:val="en-US"/>
-        </w:rPr>
-        <w:t>below 0.02 ohms during tightening;</w:t>
+        <w:t>- resistance dropped below 0.02 ohms during tightening;</w:t>
       </w:r>
     </w:p>
     <w:p>
@@ -18920,13 +19499,7 @@
         <w:rPr>
           <w:lang w:val="en-US"/>
         </w:rPr>
-        <w:t>- most likely the hardware part of the mod is defective: the resistance cannot be measured correc</w:t>
-      </w:r>
-      <w:r>
-        <w:rPr>
-          <w:lang w:val="en-US"/>
-        </w:rPr>
-        <w:t>tly at all;</w:t>
+        <w:t>- most likely the hardware part of the mod is defective: the resistance cannot be measured correctly at all;</w:t>
       </w:r>
     </w:p>
     <w:p>
@@ -19019,7 +19592,6 @@
         <w:rPr>
           <w:lang w:val="en-US"/>
         </w:rPr>
-        <w:lastRenderedPageBreak/>
         <w:t>7.7. Force PID</w:t>
       </w:r>
     </w:p>
@@ -19033,13 +19605,7 @@
         <w:rPr>
           <w:lang w:val="en-US"/>
         </w:rPr>
-        <w:t>A very small number of devices are pro</w:t>
-      </w:r>
-      <w:r>
-        <w:rPr>
-          <w:lang w:val="en-US"/>
-        </w:rPr>
-        <w:t xml:space="preserve">duced by the manufacturer with an incorrect bootloader. In this case </w:t>
+        <w:t xml:space="preserve">A very small number of devices are produced by the manufacturer with an incorrect bootloader. In this case </w:t>
       </w:r>
       <w:proofErr w:type="spellStart"/>
       <w:r>
@@ -19067,13 +19633,7 @@
         <w:rPr>
           <w:lang w:val="en-US"/>
         </w:rPr>
-        <w:t xml:space="preserve"> is a universal firmware for many devi</w:t>
-      </w:r>
-      <w:r>
-        <w:rPr>
-          <w:lang w:val="en-US"/>
-        </w:rPr>
-        <w:t xml:space="preserve">ces and reads the device ID from the bootloader and then decides how to run on the device. If </w:t>
+        <w:t xml:space="preserve"> is a universal firmware for many devices and reads the device ID from the bootloader and then decides how to run on the device. If </w:t>
       </w:r>
       <w:proofErr w:type="spellStart"/>
       <w:r>
@@ -19101,13 +19661,7 @@
         <w:rPr>
           <w:lang w:val="en-US"/>
         </w:rPr>
-        <w:t xml:space="preserve"> firmware can be used even on d</w:t>
-      </w:r>
-      <w:r>
-        <w:rPr>
-          <w:lang w:val="en-US"/>
-        </w:rPr>
-        <w:t>efective devices, you can override the device identifier (PID).</w:t>
+        <w:t xml:space="preserve"> firmware can be used even on defective devices, you can override the device identifier (PID).</w:t>
       </w:r>
     </w:p>
     <w:p>
@@ -19151,13 +19705,7 @@
         <w:rPr>
           <w:lang w:val="en-US"/>
         </w:rPr>
-        <w:t xml:space="preserve"> -&gt; Firmware Update and hold CTRL + SHIFT + ALT while selecting the firmware file, then a window with PID </w:t>
-      </w:r>
-      <w:r>
-        <w:rPr>
-          <w:lang w:val="en-US"/>
-        </w:rPr>
-        <w:t>selection will appear.</w:t>
+        <w:t xml:space="preserve"> -&gt; Firmware Update and hold CTRL + SHIFT + ALT while selecting the firmware file, then a window with PID selection will appear.</w:t>
       </w:r>
     </w:p>
     <w:p>
@@ -19208,7 +19756,6 @@
         <w:rPr>
           <w:lang w:val="en-US"/>
         </w:rPr>
-        <w:lastRenderedPageBreak/>
         <w:t>8. Authors</w:t>
       </w:r>
     </w:p>
@@ -19447,13 +19994,7 @@
         <w:rPr>
           <w:lang w:val="en-US"/>
         </w:rPr>
-        <w:t>If you like our project and would like to support its development</w:t>
-      </w:r>
-      <w:r>
-        <w:rPr>
-          <w:lang w:val="en-US"/>
-        </w:rPr>
-        <w:t xml:space="preserve">, you can </w:t>
+        <w:t xml:space="preserve">If you like our project and would like to support its development, you can </w:t>
       </w:r>
       <w:hyperlink r:id="rId56">
         <w:r>
@@ -19541,8 +20082,7 @@
     <w:sectPr>
       <w:headerReference w:type="default" r:id="rId57"/>
       <w:footerReference w:type="default" r:id="rId58"/>
-      <w:headerReference w:type="first" r:id="rId59"/>
-      <w:footerReference w:type="first" r:id="rId60"/>
+      <w:footerReference w:type="first" r:id="rId59"/>
       <w:pgSz w:w="11906" w:h="16838"/>
       <w:pgMar w:top="566" w:right="566" w:bottom="566" w:left="1140" w:header="0" w:footer="720" w:gutter="0"/>
       <w:pgNumType w:start="0"/>
@@ -19612,28 +20152,36 @@
     <w:pPr>
       <w:jc w:val="center"/>
       <w:rPr>
-        <w:color w:val="999999"/>
+        <w:color w:val="808080" w:themeColor="background1" w:themeShade="80"/>
+        <w:lang w:val="en-US"/>
       </w:rPr>
     </w:pPr>
     <w:r>
       <w:rPr>
-        <w:color w:val="999999"/>
+        <w:color w:val="808080" w:themeColor="background1" w:themeShade="80"/>
       </w:rPr>
       <w:t xml:space="preserve">Edition </w:t>
     </w:r>
     <w:proofErr w:type="spellStart"/>
     <w:r>
       <w:rPr>
-        <w:color w:val="999999"/>
+        <w:color w:val="808080" w:themeColor="background1" w:themeShade="80"/>
       </w:rPr>
       <w:t>dated</w:t>
     </w:r>
     <w:proofErr w:type="spellEnd"/>
     <w:r>
       <w:rPr>
-        <w:color w:val="999999"/>
+        <w:color w:val="808080" w:themeColor="background1" w:themeShade="80"/>
       </w:rPr>
-      <w:t xml:space="preserve"> 10/14/2018</w:t>
+      <w:t xml:space="preserve"> 1</w:t>
+    </w:r>
+    <w:r>
+      <w:rPr>
+        <w:color w:val="808080" w:themeColor="background1" w:themeShade="80"/>
+        <w:lang w:val="en-US"/>
+      </w:rPr>
+      <w:t>9.11.2025 by @rama2xl</w:t>
     </w:r>
   </w:p>
 </w:ftr>
@@ -19769,12 +20317,6 @@
       </w:r>
     </w:hyperlink>
   </w:p>
-</w:hdr>
-</file>
-
-<file path=word/header2.xml><?xml version="1.0" encoding="utf-8"?>
-<w:hdr xmlns:wpc="http://schemas.microsoft.com/office/word/2010/wordprocessingCanvas" xmlns:cx="http://schemas.microsoft.com/office/drawing/2014/chartex" xmlns:cx1="http://schemas.microsoft.com/office/drawing/2015/9/8/chartex" xmlns:cx2="http://schemas.microsoft.com/office/drawing/2015/10/21/chartex" xmlns:cx3="http://schemas.microsoft.com/office/drawing/2016/5/9/chartex" xmlns:cx4="http://schemas.microsoft.com/office/drawing/2016/5/10/chartex" xmlns:cx5="http://schemas.microsoft.com/office/drawing/2016/5/11/chartex" xmlns:cx6="http://schemas.microsoft.com/office/drawing/2016/5/12/chartex" xmlns:cx7="http://schemas.microsoft.com/office/drawing/2016/5/13/chartex" xmlns:cx8="http://schemas.microsoft.com/office/drawing/2016/5/14/chartex" xmlns:mc="http://schemas.openxmlformats.org/markup-compatibility/2006" xmlns:aink="http://schemas.microsoft.com/office/drawing/2016/ink" xmlns:am3d="http://schemas.microsoft.com/office/drawing/2017/model3d" xmlns:o="urn:schemas-microsoft-com:office:office" xmlns:r="http://schemas.openxmlformats.org/officeDocument/2006/relationships" xmlns:m="http://schemas.openxmlformats.org/officeDocument/2006/math" xmlns:v="urn:schemas-microsoft-com:vml" xmlns:wp14="http://schemas.microsoft.com/office/word/2010/wordprocessingDrawing" xmlns:wp="http://schemas.openxmlformats.org/drawingml/2006/wordprocessingDrawing" xmlns:w10="urn:schemas-microsoft-com:office:word" xmlns:w="http://schemas.openxmlformats.org/wordprocessingml/2006/main" xmlns:w14="http://schemas.microsoft.com/office/word/2010/wordml" xmlns:w15="http://schemas.microsoft.com/office/word/2012/wordml" xmlns:w16cex="http://schemas.microsoft.com/office/word/2018/wordml/cex" xmlns:w16cid="http://schemas.microsoft.com/office/word/2016/wordml/cid" xmlns:w16="http://schemas.microsoft.com/office/word/2018/wordml" xmlns:w16sdtdh="http://schemas.microsoft.com/office/word/2020/wordml/sdtdatahash" xmlns:w16se="http://schemas.microsoft.com/office/word/2015/wordml/symex" xmlns:wpg="http://schemas.microsoft.com/office/word/2010/wordprocessingGroup" xmlns:wpi="http://schemas.microsoft.com/office/word/2010/wordprocessingInk" xmlns:wne="http://schemas.microsoft.com/office/word/2006/wordml" xmlns:wps="http://schemas.microsoft.com/office/word/2010/wordprocessingShape" mc:Ignorable="w14 w15 w16se w16cid w16 w16cex w16sdtdh wp14">
-  <w:p/>
 </w:hdr>
 </file>
 
@@ -23145,6 +23687,50 @@
       </w:tblCellMar>
     </w:tblPr>
   </w:style>
+  <w:style w:type="paragraph" w:styleId="aa">
+    <w:name w:val="header"/>
+    <w:basedOn w:val="a"/>
+    <w:link w:val="ab"/>
+    <w:uiPriority w:val="99"/>
+    <w:unhideWhenUsed/>
+    <w:rsid w:val="00D161C9"/>
+    <w:pPr>
+      <w:tabs>
+        <w:tab w:val="center" w:pos="4677"/>
+        <w:tab w:val="right" w:pos="9355"/>
+      </w:tabs>
+      <w:spacing w:after="0" w:line="240" w:lineRule="auto"/>
+    </w:pPr>
+  </w:style>
+  <w:style w:type="character" w:customStyle="1" w:styleId="ab">
+    <w:name w:val="Верхний колонтитул Знак"/>
+    <w:basedOn w:val="a0"/>
+    <w:link w:val="aa"/>
+    <w:uiPriority w:val="99"/>
+    <w:rsid w:val="00D161C9"/>
+  </w:style>
+  <w:style w:type="paragraph" w:styleId="ac">
+    <w:name w:val="footer"/>
+    <w:basedOn w:val="a"/>
+    <w:link w:val="ad"/>
+    <w:uiPriority w:val="99"/>
+    <w:unhideWhenUsed/>
+    <w:rsid w:val="00D161C9"/>
+    <w:pPr>
+      <w:tabs>
+        <w:tab w:val="center" w:pos="4677"/>
+        <w:tab w:val="right" w:pos="9355"/>
+      </w:tabs>
+      <w:spacing w:after="0" w:line="240" w:lineRule="auto"/>
+    </w:pPr>
+  </w:style>
+  <w:style w:type="character" w:customStyle="1" w:styleId="ad">
+    <w:name w:val="Нижний колонтитул Знак"/>
+    <w:basedOn w:val="a0"/>
+    <w:link w:val="ac"/>
+    <w:uiPriority w:val="99"/>
+    <w:rsid w:val="00D161C9"/>
+  </w:style>
 </w:styles>
 </file>
 

</xml_diff>